<commit_message>
Final Commit for project submission
</commit_message>
<xml_diff>
--- a/report/Sentiment Analysis - Applied ML.docx
+++ b/report/Sentiment Analysis - Applied ML.docx
@@ -20,7 +20,7 @@
           <w:szCs w:val="16"/>
         </w:rPr>
         <w:sectPr>
-          <w:footerReference w:type="first" r:id="rId8"/>
+          <w:footerReference w:type="first" r:id="rId10"/>
           <w:pgSz w:w="12240" w:h="15840" w:code="1"/>
           <w:pgMar w:top="1080" w:right="893" w:bottom="1440" w:left="893" w:header="720" w:footer="720" w:gutter="0"/>
           <w:cols w:space="720"/>
@@ -64,7 +64,7 @@
         </w:rPr>
         <w:br/>
       </w:r>
-      <w:hyperlink r:id="rId9" w:history="1">
+      <w:hyperlink r:id="rId11" w:history="1">
         <w:r>
           <w:rPr>
             <w:rStyle w:val="Hyperlink"/>
@@ -117,15 +117,7 @@
     </w:p>
     <w:p>
       <w:r>
-        <w:t>This study presents a comprehensive, engineering-driven evaluation of natural language processing (NLP) systems ranging from classical machine-learning pipelines to modern Transformer-based architectures. Using the AG News corpus as a benchmark, we systematically implement and compare Bag-of-Words (</w:t>
-      </w:r>
-      <w:proofErr w:type="spellStart"/>
-      <w:r>
-        <w:t>BoW</w:t>
-      </w:r>
-      <w:proofErr w:type="spellEnd"/>
-      <w:r>
-        <w:t xml:space="preserve">), TF-IDF, Word2Vec embeddings, deep neural models, and BERT-based Transformers, with all systems built or fine-tuned from first principles. Exploratory data analysis highlights the linguistic characteristics of the dataset, while model evaluation covers accuracy, F1-score, inference latency, training time, and computational complexity (FLOPs). Experimental results from </w:t>
+        <w:t xml:space="preserve">This study presents a comprehensive, engineering-driven evaluation of natural language processing (NLP) systems ranging from classical machine-learning pipelines to modern Transformer-based architectures. Using the AG News corpus as a benchmark, we systematically implement and compare Bag-of-Words (BoW), TF-IDF, Word2Vec embeddings, deep neural models, and BERT-based Transformers, with all systems built or fine-tuned from first principles. Exploratory data analysis highlights the linguistic characteristics of the dataset, while model evaluation covers accuracy, F1-score, inference latency, training time, and computational complexity (FLOPs). Experimental results from </w:t>
       </w:r>
       <w:r>
         <w:rPr>
@@ -136,15 +128,7 @@
         <w:t>results.csv</w:t>
       </w:r>
       <w:r>
-        <w:t xml:space="preserve"> show that classical linear models such as TF-IDF + Logistic Regression achieve strong baseline performance at low computational cost, whereas deep neural networks (MLP, Word2Vec-based models) improve accuracy at significantly higher complexity. Transformer-based models, implemented using TensorFlow and </w:t>
-      </w:r>
-      <w:proofErr w:type="spellStart"/>
-      <w:r>
-        <w:t>HuggingFace</w:t>
-      </w:r>
-      <w:proofErr w:type="spellEnd"/>
-      <w:r>
-        <w:t>, exhibit the strongest representational capability but also the highest resource requirements. The work demonstrates how architectural progression—from linear classifiers to CNN/MLP embeddings and finally to self-attention—affects efficiency, scalability, and downstream performance. This comparison provides insight into hardware-aware model selection and establishes a unified framework that connects foundational neural concepts to today’s state-of-the-art Transformer systems.</w:t>
+        <w:t xml:space="preserve"> show that classical linear models such as TF-IDF + Logistic Regression achieve strong baseline performance at low computational cost, whereas deep neural networks (MLP, Word2Vec-based models) improve accuracy at significantly higher complexity. Transformer-based models, implemented using TensorFlow and HuggingFace, exhibit the strongest representational capability but also the highest resource requirements. The work demonstrates how architectural progression—from linear classifiers to CNN/MLP embeddings and finally to self-attention—affects efficiency, scalability, and downstream performance. This comparison provides insight into hardware-aware model selection and establishes a unified framework that connects foundational neural concepts to today’s state-of-the-art Transformer systems.</w:t>
       </w:r>
     </w:p>
     <w:p>
@@ -218,21 +202,7 @@
         <w:rPr>
           <w:lang w:val="en-CA"/>
         </w:rPr>
-        <w:t>This work provides an end-to-end empirical study of NLP architectures across the classical-to-modern spectrum using the AG News dataset. We implement and analyze Bag-of-Words (</w:t>
-      </w:r>
-      <w:proofErr w:type="spellStart"/>
-      <w:r>
-        <w:rPr>
-          <w:lang w:val="en-CA"/>
-        </w:rPr>
-        <w:t>BoW</w:t>
-      </w:r>
-      <w:proofErr w:type="spellEnd"/>
-      <w:r>
-        <w:rPr>
-          <w:lang w:val="en-CA"/>
-        </w:rPr>
-        <w:t xml:space="preserve">), TF-IDF, traditional machine-learning classifiers, embedding-based deep learning models (MLP, Word2Vec), and finally a fine-tuned BERT Transformer. Our goal is not only to compare accuracy, F1-score, and </w:t>
+        <w:t xml:space="preserve">This work provides an end-to-end empirical study of NLP architectures across the classical-to-modern spectrum using the AG News dataset. We implement and analyze Bag-of-Words (BoW), TF-IDF, traditional machine-learning classifiers, embedding-based deep learning models (MLP, Word2Vec), and finally a fine-tuned BERT Transformer. Our goal is not only to compare accuracy, F1-score, and </w:t>
       </w:r>
       <w:r>
         <w:rPr>
@@ -270,16 +240,8 @@
         <w:rPr>
           <w:lang w:val="en-CA"/>
         </w:rPr>
-        <w:t xml:space="preserve">A unified framework connecting foundational NLP approaches with state-of-the-art Transformer models, grounded in the mathematical and computational principles introduced in the project </w:t>
-      </w:r>
-      <w:proofErr w:type="gramStart"/>
-      <w:r>
-        <w:rPr>
-          <w:lang w:val="en-CA"/>
-        </w:rPr>
-        <w:t>proposal;</w:t>
-      </w:r>
-      <w:proofErr w:type="gramEnd"/>
+        <w:t>A unified framework connecting foundational NLP approaches with state-of-the-art Transformer models, grounded in the mathematical and computational principles introduced in the project proposal;</w:t>
+      </w:r>
     </w:p>
     <w:p>
       <w:pPr>
@@ -296,16 +258,8 @@
         <w:rPr>
           <w:lang w:val="en-CA"/>
         </w:rPr>
-        <w:t xml:space="preserve">A comprehensive experimental comparison across classical, deep, and transformer-based architectures using consistent preprocessing, metrics, and hardware </w:t>
-      </w:r>
-      <w:proofErr w:type="gramStart"/>
-      <w:r>
-        <w:rPr>
-          <w:lang w:val="en-CA"/>
-        </w:rPr>
-        <w:t>setups;</w:t>
-      </w:r>
-      <w:proofErr w:type="gramEnd"/>
+        <w:t>A comprehensive experimental comparison across classical, deep, and transformer-based architectures using consistent preprocessing, metrics, and hardware setups;</w:t>
+      </w:r>
     </w:p>
     <w:p>
       <w:pPr>
@@ -409,62 +363,20 @@
         <w:rPr>
           <w:lang w:val="en-CA" w:eastAsia="zh-CN"/>
         </w:rPr>
-        <w:t xml:space="preserve">Subsequent improvements emerged with ADALINE (1960) and the Least Mean Squares (LMS) rule developed by </w:t>
-      </w:r>
-      <w:proofErr w:type="spellStart"/>
-      <w:r>
+        <w:t>Subsequent improvements emerged with ADALINE (1960) and the Least Mean Squares (LMS) rule developed by Widrow and Hoff, introducing linear activation and gradient-based optimization that more closely resembles modern training algorithms. These early models were restricted to single-layer architectures until the resurgence of neural networks in the 1980s, when Rumelhart, Hinton, and Williams popularized backpropagation (1986), enabling efficient training of multi-layer perceptrons (MLPs). This allowed neural systems to represent complex nonlinear functions and supported deeper architectures with differentiable activation functions.</w:t>
+      </w:r>
+    </w:p>
+    <w:p>
+      <w:pPr>
         <w:rPr>
           <w:lang w:val="en-CA" w:eastAsia="zh-CN"/>
         </w:rPr>
-        <w:t>Widrow</w:t>
-      </w:r>
-      <w:proofErr w:type="spellEnd"/>
+      </w:pPr>
       <w:r>
         <w:rPr>
           <w:lang w:val="en-CA" w:eastAsia="zh-CN"/>
         </w:rPr>
-        <w:t xml:space="preserve"> and Hoff, introducing linear activation and gradient-based optimization that more closely resembles modern training algorithms. These early models were restricted to single-layer architectures until the resurgence of neural networks in the 1980s, when Rumelhart, Hinton, and Williams popularized backpropagation (1986), enabling efficient training of multi-layer </w:t>
-      </w:r>
-      <w:proofErr w:type="spellStart"/>
-      <w:r>
-        <w:rPr>
-          <w:lang w:val="en-CA" w:eastAsia="zh-CN"/>
-        </w:rPr>
-        <w:t>perceptrons</w:t>
-      </w:r>
-      <w:proofErr w:type="spellEnd"/>
-      <w:r>
-        <w:rPr>
-          <w:lang w:val="en-CA" w:eastAsia="zh-CN"/>
-        </w:rPr>
-        <w:t xml:space="preserve"> (MLPs). This allowed neural systems to represent complex nonlinear functions and supported deeper architectures with differentiable activation functions.</w:t>
-      </w:r>
-    </w:p>
-    <w:p>
-      <w:pPr>
-        <w:rPr>
-          <w:lang w:val="en-CA" w:eastAsia="zh-CN"/>
-        </w:rPr>
-      </w:pPr>
-      <w:r>
-        <w:rPr>
-          <w:lang w:val="en-CA" w:eastAsia="zh-CN"/>
-        </w:rPr>
-        <w:t xml:space="preserve">While MLPs paved the way for neural sequence modeling, handling long-term dependencies remained a challenge. Hochreiter and </w:t>
-      </w:r>
-      <w:proofErr w:type="spellStart"/>
-      <w:r>
-        <w:rPr>
-          <w:lang w:val="en-CA" w:eastAsia="zh-CN"/>
-        </w:rPr>
-        <w:t>Schmidhuber</w:t>
-      </w:r>
-      <w:proofErr w:type="spellEnd"/>
-      <w:r>
-        <w:rPr>
-          <w:lang w:val="en-CA" w:eastAsia="zh-CN"/>
-        </w:rPr>
-        <w:t xml:space="preserve"> addressed this with Long Short-Term Memory (LSTM) networks (1997), which introduced gated memory units to mitigate vanishing and exploding gradients. LSTMs and GRUs became dominant architectures for NLP tasks for nearly two decades, powering applications such as machine translation, sentiment analysis, and speech recognition.</w:t>
+        <w:t>While MLPs paved the way for neural sequence modeling, handling long-term dependencies remained a challenge. Hochreiter and Schmidhuber addressed this with Long Short-Term Memory (LSTM) networks (1997), which introduced gated memory units to mitigate vanishing and exploding gradients. LSTMs and GRUs became dominant architectures for NLP tasks for nearly two decades, powering applications such as machine translation, sentiment analysis, and speech recognition.</w:t>
       </w:r>
     </w:p>
     <w:p>
@@ -491,21 +403,7 @@
         <w:rPr>
           <w:lang w:val="en-CA" w:eastAsia="zh-CN"/>
         </w:rPr>
-        <w:t xml:space="preserve"> (2017). By replacing recurrence with self-attention, Transformers enabled parallel computation over sequences, improved modeling of long-range dependencies, and significantly reduced training time on modern hardware accelerators. This design ultimately led to the development of large-scale pre-trained models such as BERT, GPT, and T5, which dominate contemporary NLP benchmarks. BERT</w:t>
-      </w:r>
-      <w:proofErr w:type="gramStart"/>
-      <w:r>
-        <w:rPr>
-          <w:lang w:val="en-CA" w:eastAsia="zh-CN"/>
-        </w:rPr>
-        <w:t>, in particular, introduced</w:t>
-      </w:r>
-      <w:proofErr w:type="gramEnd"/>
-      <w:r>
-        <w:rPr>
-          <w:lang w:val="en-CA" w:eastAsia="zh-CN"/>
-        </w:rPr>
-        <w:t xml:space="preserve"> bidirectional masked language modeling, enabling deep contextual understanding of text.</w:t>
+        <w:t xml:space="preserve"> (2017). By replacing recurrence with self-attention, Transformers enabled parallel computation over sequences, improved modeling of long-range dependencies, and significantly reduced training time on modern hardware accelerators. This design ultimately led to the development of large-scale pre-trained models such as BERT, GPT, and T5, which dominate contemporary NLP benchmarks. BERT, in particular, introduced bidirectional masked language modeling, enabling deep contextual understanding of text.</w:t>
       </w:r>
     </w:p>
     <w:p>
@@ -639,36 +537,12 @@
         <w:ind w:left="720"/>
       </w:pPr>
       <w:r>
-        <w:t>label: integer in {0,1,</w:t>
-      </w:r>
-      <w:proofErr w:type="gramStart"/>
-      <w:r>
-        <w:t>2,3},</w:t>
-      </w:r>
-      <w:proofErr w:type="gramEnd"/>
-      <w:r>
-        <w:t xml:space="preserve"> representing one of the four classes</w:t>
-      </w:r>
-    </w:p>
-    <w:p>
-      <w:r>
-        <w:t xml:space="preserve">The dataset was downloaded from the </w:t>
-      </w:r>
-      <w:proofErr w:type="spellStart"/>
-      <w:r>
-        <w:t>HuggingFace</w:t>
-      </w:r>
-      <w:proofErr w:type="spellEnd"/>
-      <w:r>
-        <w:t xml:space="preserve"> Datasets library and converted into Pandas </w:t>
-      </w:r>
-      <w:proofErr w:type="spellStart"/>
-      <w:r>
-        <w:t>DataFrames</w:t>
-      </w:r>
-      <w:proofErr w:type="spellEnd"/>
-      <w:r>
-        <w:t xml:space="preserve"> for analysis.</w:t>
+        <w:t>label: integer in {0,1,2,3}, representing one of the four classes</w:t>
+      </w:r>
+    </w:p>
+    <w:p>
+      <w:r>
+        <w:t>The dataset was downloaded from the HuggingFace Datasets library and converted into Pandas DataFrames for analysis.</w:t>
       </w:r>
     </w:p>
     <w:p>
@@ -686,15 +560,7 @@
     </w:p>
     <w:p>
       <w:r>
-        <w:t xml:space="preserve">The distribution of </w:t>
-      </w:r>
-      <w:proofErr w:type="gramStart"/>
-      <w:r>
-        <w:t>word counts</w:t>
-      </w:r>
-      <w:proofErr w:type="gramEnd"/>
-      <w:r>
-        <w:t xml:space="preserve"> shows that most articles fall between 20 and 50 words.</w:t>
+        <w:t>The distribution of word counts shows that most articles fall between 20 and 50 words.</w:t>
       </w:r>
       <w:r>
         <w:br/>
@@ -726,7 +592,7 @@
                     <pic:cNvPicPr/>
                   </pic:nvPicPr>
                   <pic:blipFill>
-                    <a:blip r:embed="rId10" cstate="print">
+                    <a:blip r:embed="rId12" cstate="print">
                       <a:extLst>
                         <a:ext uri="{28A0092B-C50C-407E-A947-70E740481C1C}">
                           <a14:useLocalDpi xmlns:a14="http://schemas.microsoft.com/office/drawing/2010/main" val="0"/>
@@ -795,13 +661,8 @@
           <w:numId w:val="5"/>
         </w:numPr>
       </w:pPr>
-      <w:proofErr w:type="spellStart"/>
-      <w:r>
-        <w:t>stopword</w:t>
-      </w:r>
-      <w:proofErr w:type="spellEnd"/>
-      <w:r>
-        <w:t xml:space="preserve"> removal (for classical models),</w:t>
+      <w:r>
+        <w:t>stopword removal (for classical models),</w:t>
       </w:r>
     </w:p>
     <w:p>
@@ -812,13 +673,8 @@
           <w:numId w:val="5"/>
         </w:numPr>
       </w:pPr>
-      <w:proofErr w:type="spellStart"/>
-      <w:r>
-        <w:t>subword</w:t>
-      </w:r>
-      <w:proofErr w:type="spellEnd"/>
-      <w:r>
-        <w:t xml:space="preserve"> tokenization (for BERT),</w:t>
+      <w:r>
+        <w:t>subword tokenization (for BERT),</w:t>
       </w:r>
     </w:p>
     <w:p>
@@ -830,15 +686,7 @@
         </w:numPr>
       </w:pPr>
       <w:r>
-        <w:t xml:space="preserve">dimensionality reduction (e.g., limiting </w:t>
-      </w:r>
-      <w:proofErr w:type="spellStart"/>
-      <w:r>
-        <w:t>BoW</w:t>
-      </w:r>
-      <w:proofErr w:type="spellEnd"/>
-      <w:r>
-        <w:t xml:space="preserve"> and TF-IDF to 5,000 features).</w:t>
+        <w:t>dimensionality reduction (e.g., limiting BoW and TF-IDF to 5,000 features).</w:t>
       </w:r>
     </w:p>
     <w:p>
@@ -867,7 +715,7 @@
                     <pic:cNvPicPr/>
                   </pic:nvPicPr>
                   <pic:blipFill>
-                    <a:blip r:embed="rId11" cstate="print">
+                    <a:blip r:embed="rId13" cstate="print">
                       <a:extLst>
                         <a:ext uri="{28A0092B-C50C-407E-A947-70E740481C1C}">
                           <a14:useLocalDpi xmlns:a14="http://schemas.microsoft.com/office/drawing/2010/main" val="0"/>
@@ -1352,7 +1200,7 @@
                     <pic:cNvPicPr/>
                   </pic:nvPicPr>
                   <pic:blipFill>
-                    <a:blip r:embed="rId12" cstate="print">
+                    <a:blip r:embed="rId14" cstate="print">
                       <a:extLst>
                         <a:ext uri="{28A0092B-C50C-407E-A947-70E740481C1C}">
                           <a14:useLocalDpi xmlns:a14="http://schemas.microsoft.com/office/drawing/2010/main" val="0"/>
@@ -1430,23 +1278,7 @@
           <w:sz w:val="16"/>
           <w:szCs w:val="16"/>
         </w:rPr>
-        <w:t xml:space="preserve">Most common words after applying </w:t>
-      </w:r>
-      <w:proofErr w:type="spellStart"/>
-      <w:r>
-        <w:rPr>
-          <w:sz w:val="16"/>
-          <w:szCs w:val="16"/>
-        </w:rPr>
-        <w:t>stopword</w:t>
-      </w:r>
-      <w:proofErr w:type="spellEnd"/>
-      <w:r>
-        <w:rPr>
-          <w:sz w:val="16"/>
-          <w:szCs w:val="16"/>
-        </w:rPr>
-        <w:t xml:space="preserve"> removal.</w:t>
+        <w:t>Most common words after applying stopword removal.</w:t>
       </w:r>
     </w:p>
     <w:p>
@@ -1463,7 +1295,6 @@
       <w:r>
         <w:t xml:space="preserve">, </w:t>
       </w:r>
-      <w:proofErr w:type="gramStart"/>
       <w:r>
         <w:rPr>
           <w:i/>
@@ -1471,7 +1302,6 @@
         </w:rPr>
         <w:t>new</w:t>
       </w:r>
-      <w:proofErr w:type="gramEnd"/>
       <w:r>
         <w:t xml:space="preserve">, </w:t>
       </w:r>
@@ -1506,7 +1336,7 @@
           <w14:ligatures w14:val="standardContextual"/>
         </w:rPr>
         <w:drawing>
-          <wp:inline distT="0" distB="0" distL="0" distR="0" wp14:anchorId="530AA750" wp14:editId="5BB589D0">
+          <wp:inline distT="0" distB="0" distL="0" distR="0" wp14:anchorId="530AA750" wp14:editId="700FDB53">
             <wp:extent cx="2747010" cy="1717040"/>
             <wp:effectExtent l="0" t="0" r="0" b="0"/>
             <wp:docPr id="1568085624" name="Picture 4" descr="A graph of a number of bars&#10;&#10;AI-generated content may be incorrect."/>
@@ -1521,7 +1351,7 @@
                     <pic:cNvPicPr/>
                   </pic:nvPicPr>
                   <pic:blipFill>
-                    <a:blip r:embed="rId13" cstate="print">
+                    <a:blip r:embed="rId15" cstate="print">
                       <a:extLst>
                         <a:ext uri="{28A0092B-C50C-407E-A947-70E740481C1C}">
                           <a14:useLocalDpi xmlns:a14="http://schemas.microsoft.com/office/drawing/2010/main" val="0"/>
@@ -1610,7 +1440,7 @@
                     <pic:cNvPicPr/>
                   </pic:nvPicPr>
                   <pic:blipFill>
-                    <a:blip r:embed="rId14">
+                    <a:blip r:embed="rId16">
                       <a:extLst>
                         <a:ext uri="{28A0092B-C50C-407E-A947-70E740481C1C}">
                           <a14:useLocalDpi xmlns:a14="http://schemas.microsoft.com/office/drawing/2010/main" val="0"/>
@@ -1733,15 +1563,7 @@
     <w:p/>
     <w:p>
       <w:r>
-        <w:t xml:space="preserve">The table suggests that Mean and Median count of words are </w:t>
-      </w:r>
-      <w:proofErr w:type="gramStart"/>
-      <w:r>
-        <w:t>similar</w:t>
-      </w:r>
-      <w:proofErr w:type="gramEnd"/>
-      <w:r>
-        <w:t xml:space="preserve"> suggesting the dataset is balanced and very less right skewness.</w:t>
+        <w:t>The table suggests that Mean and Median count of words are similar suggesting the dataset is balanced and very less right skewness.</w:t>
       </w:r>
     </w:p>
     <w:p>
@@ -1758,13 +1580,8 @@
       <w:pPr>
         <w:pStyle w:val="Heading2"/>
       </w:pPr>
-      <w:proofErr w:type="spellStart"/>
-      <w:r>
-        <w:t>Word</w:t>
-      </w:r>
-      <w:proofErr w:type="spellEnd"/>
-      <w:r>
-        <w:t xml:space="preserve"> Cloud Analysis per Class</w:t>
+      <w:r>
+        <w:t>Word Cloud Analysis per Class</w:t>
       </w:r>
     </w:p>
     <w:p>
@@ -1792,7 +1609,7 @@
                     <pic:cNvPicPr/>
                   </pic:nvPicPr>
                   <pic:blipFill>
-                    <a:blip r:embed="rId15" cstate="print">
+                    <a:blip r:embed="rId17" cstate="print">
                       <a:extLst>
                         <a:ext uri="{28A0092B-C50C-407E-A947-70E740481C1C}">
                           <a14:useLocalDpi xmlns:a14="http://schemas.microsoft.com/office/drawing/2010/main" val="0"/>
@@ -1879,31 +1696,7 @@
         <w:t xml:space="preserve"> for Business), validating that topic boundaries are well-defined and</w:t>
       </w:r>
       <w:r>
-        <w:t xml:space="preserve"> apart from the </w:t>
-      </w:r>
-      <w:proofErr w:type="spellStart"/>
-      <w:r>
-        <w:t>stopwords</w:t>
-      </w:r>
-      <w:proofErr w:type="spellEnd"/>
-      <w:r>
-        <w:t xml:space="preserve"> like ‘</w:t>
-      </w:r>
-      <w:proofErr w:type="spellStart"/>
-      <w:r>
-        <w:t>and’,’in’,’the</w:t>
-      </w:r>
-      <w:proofErr w:type="spellEnd"/>
-      <w:r>
-        <w:t xml:space="preserve">’ </w:t>
-      </w:r>
-      <w:proofErr w:type="spellStart"/>
-      <w:r>
-        <w:t>etc</w:t>
-      </w:r>
-      <w:proofErr w:type="spellEnd"/>
-      <w:r>
-        <w:t xml:space="preserve"> the words are</w:t>
+        <w:t xml:space="preserve"> apart from the stopwords like ‘and’,’in’,’the’ etc the words are</w:t>
       </w:r>
       <w:r>
         <w:t xml:space="preserve"> separable—favorable for classification tasks.</w:t>
@@ -1993,15 +1786,7 @@
         <w:t xml:space="preserve">The goal of this study is to evaluate NLP models spanning classical statistical approaches, neural embedding models, and modern Transformer architectures. All models are trained and tested on the </w:t>
       </w:r>
       <w:r>
-        <w:t xml:space="preserve">AG News dataset under consistent preprocessing, splitting, and evaluation procedures. This section details the feature extraction strategies, model </w:t>
-      </w:r>
-      <w:proofErr w:type="gramStart"/>
-      <w:r>
-        <w:t>architectures</w:t>
-      </w:r>
-      <w:proofErr w:type="gramEnd"/>
-      <w:r>
-        <w:t>, training pipelines, and computational considerations used throughout the experiments.</w:t>
+        <w:t>AG News dataset under consistent preprocessing, splitting, and evaluation procedures. This section details the feature extraction strategies, model architectures, training pipelines, and computational considerations used throughout the experiments.</w:t>
       </w:r>
     </w:p>
     <w:p>
@@ -2044,25 +1829,7 @@
           <w:bCs/>
           <w:lang w:val="en-CA"/>
         </w:rPr>
-        <w:t>Classical ML models (</w:t>
-      </w:r>
-      <w:proofErr w:type="spellStart"/>
-      <w:r>
-        <w:rPr>
-          <w:b/>
-          <w:bCs/>
-          <w:lang w:val="en-CA"/>
-        </w:rPr>
-        <w:t>BoW</w:t>
-      </w:r>
-      <w:proofErr w:type="spellEnd"/>
-      <w:r>
-        <w:rPr>
-          <w:b/>
-          <w:bCs/>
-          <w:lang w:val="en-CA"/>
-        </w:rPr>
-        <w:t>, TF-IDF):</w:t>
+        <w:t>Classical ML models (BoW, TF-IDF):</w:t>
       </w:r>
     </w:p>
     <w:p>
@@ -2126,19 +1893,11 @@
           <w:lang w:val="en-CA"/>
         </w:rPr>
       </w:pPr>
-      <w:proofErr w:type="spellStart"/>
-      <w:r>
-        <w:rPr>
-          <w:lang w:val="en-CA"/>
-        </w:rPr>
-        <w:t>stopword</w:t>
-      </w:r>
-      <w:proofErr w:type="spellEnd"/>
-      <w:r>
-        <w:rPr>
-          <w:lang w:val="en-CA"/>
-        </w:rPr>
-        <w:t xml:space="preserve"> removal </w:t>
+      <w:r>
+        <w:rPr>
+          <w:lang w:val="en-CA"/>
+        </w:rPr>
+        <w:t xml:space="preserve">stopword removal </w:t>
       </w:r>
     </w:p>
     <w:p>
@@ -2174,13 +1933,7 @@
         <w:rPr>
           <w:lang w:val="en-CA"/>
         </w:rPr>
-        <w:t>limiting vocabulary size to 5,000 most informative terms</w:t>
-      </w:r>
-      <w:r>
-        <w:rPr>
-          <w:lang w:val="en-CA"/>
-        </w:rPr>
-        <w:t>.</w:t>
+        <w:t>limiting vocabulary size to 5,000 most informative terms.</w:t>
       </w:r>
     </w:p>
     <w:p>
@@ -2325,21 +2078,8 @@
           <w:numId w:val="11"/>
         </w:numPr>
       </w:pPr>
-      <w:proofErr w:type="spellStart"/>
-      <w:r>
-        <w:t>WordPiece</w:t>
-      </w:r>
-      <w:proofErr w:type="spellEnd"/>
-      <w:r>
-        <w:t xml:space="preserve"> tokenization using the </w:t>
-      </w:r>
-      <w:proofErr w:type="spellStart"/>
-      <w:r>
-        <w:t>bert</w:t>
-      </w:r>
-      <w:proofErr w:type="spellEnd"/>
-      <w:r>
-        <w:t>-base-uncased tokenizer</w:t>
+      <w:r>
+        <w:t>WordPiece tokenization using the bert-base-uncased tokenizer</w:t>
       </w:r>
     </w:p>
     <w:p>
@@ -2384,15 +2124,7 @@
         </w:rPr>
       </w:pPr>
       <w:r>
-        <w:t xml:space="preserve">No </w:t>
-      </w:r>
-      <w:proofErr w:type="spellStart"/>
-      <w:r>
-        <w:t>stopword</w:t>
-      </w:r>
-      <w:proofErr w:type="spellEnd"/>
-      <w:r>
-        <w:t xml:space="preserve"> removal or lowercasing beyond what the tokenizer applies internally</w:t>
+        <w:t>No stopword removal or lowercasing beyond what the tokenizer applies internally</w:t>
       </w:r>
       <w:r>
         <w:rPr>
@@ -2403,15 +2135,7 @@
     </w:p>
     <w:p>
       <w:r>
-        <w:t xml:space="preserve">Dataset splits followed the </w:t>
-      </w:r>
-      <w:proofErr w:type="spellStart"/>
-      <w:r>
-        <w:t>HuggingFace</w:t>
-      </w:r>
-      <w:proofErr w:type="spellEnd"/>
-      <w:r>
-        <w:t xml:space="preserve"> default partitioning:</w:t>
+        <w:t>Dataset splits followed the HuggingFace default partitioning:</w:t>
       </w:r>
     </w:p>
     <w:p>
@@ -2464,21 +2188,7 @@
         <w:rPr>
           <w:lang w:val="en-CA"/>
         </w:rPr>
-        <w:t xml:space="preserve"> (</w:t>
-      </w:r>
-      <w:proofErr w:type="spellStart"/>
-      <w:r>
-        <w:rPr>
-          <w:lang w:val="en-CA"/>
-        </w:rPr>
-        <w:t>BoW</w:t>
-      </w:r>
-      <w:proofErr w:type="spellEnd"/>
-      <w:r>
-        <w:rPr>
-          <w:lang w:val="en-CA"/>
-        </w:rPr>
-        <w:t>)</w:t>
+        <w:t xml:space="preserve"> (BoW)</w:t>
       </w:r>
     </w:p>
     <w:p>
@@ -2494,7 +2204,6 @@
         </w:rPr>
         <w:t xml:space="preserve">A </w:t>
       </w:r>
-      <w:proofErr w:type="spellStart"/>
       <w:r>
         <w:rPr>
           <w:bCs/>
@@ -2502,7 +2211,6 @@
         </w:rPr>
         <w:t>CountVectorizer</w:t>
       </w:r>
-      <w:proofErr w:type="spellEnd"/>
       <w:r>
         <w:rPr>
           <w:lang w:val="en-CA"/>
@@ -2543,35 +2251,7 @@
         <w:rPr>
           <w:lang w:val="en-CA"/>
         </w:rPr>
-        <w:t xml:space="preserve">Both </w:t>
-      </w:r>
-      <w:proofErr w:type="spellStart"/>
-      <w:r>
-        <w:rPr>
-          <w:lang w:val="en-CA"/>
-        </w:rPr>
-        <w:t>BoW</w:t>
-      </w:r>
-      <w:proofErr w:type="spellEnd"/>
-      <w:r>
-        <w:rPr>
-          <w:lang w:val="en-CA"/>
-        </w:rPr>
-        <w:t xml:space="preserve"> and TF-IDF feature matrices were used as inputs to classical machine learning models including Logistic Regression, Random Forest, </w:t>
-      </w:r>
-      <w:proofErr w:type="spellStart"/>
-      <w:r>
-        <w:rPr>
-          <w:lang w:val="en-CA"/>
-        </w:rPr>
-        <w:t>XGBoost</w:t>
-      </w:r>
-      <w:proofErr w:type="spellEnd"/>
-      <w:r>
-        <w:rPr>
-          <w:lang w:val="en-CA"/>
-        </w:rPr>
-        <w:t>, and MLP.</w:t>
+        <w:t>Both BoW and TF-IDF feature matrices were used as inputs to classical machine learning models including Logistic Regression, Random Forest, XGBoost, and MLP.</w:t>
       </w:r>
       <w:r>
         <w:t xml:space="preserve"> </w:t>
@@ -2597,15 +2277,7 @@
         </w:rPr>
       </w:pPr>
       <w:r>
-        <w:t xml:space="preserve">The following classifiers were trained on </w:t>
-      </w:r>
-      <w:proofErr w:type="spellStart"/>
-      <w:r>
-        <w:t>BoW</w:t>
-      </w:r>
-      <w:proofErr w:type="spellEnd"/>
-      <w:r>
-        <w:t xml:space="preserve"> and TF-IDF features, as implemented in the project notebooks:</w:t>
+        <w:t>The following classifiers were trained on BoW and TF-IDF features, as implemented in the project notebooks:</w:t>
       </w:r>
     </w:p>
     <w:p>
@@ -2658,23 +2330,34 @@
       <w:pPr>
         <w:pStyle w:val="Heading3"/>
       </w:pPr>
-      <w:proofErr w:type="spellStart"/>
       <w:r>
         <w:rPr>
           <w:rStyle w:val="Strong"/>
           <w:b w:val="0"/>
           <w:bCs w:val="0"/>
         </w:rPr>
-        <w:t>XGBoost</w:t>
-      </w:r>
-      <w:proofErr w:type="spellEnd"/>
+        <w:t>XGBoost Classifier</w:t>
+      </w:r>
+    </w:p>
+    <w:p>
+      <w:pPr>
+        <w:ind w:left="360"/>
+      </w:pPr>
+      <w:r>
+        <w:t>A gradient-boosted decision tree model optimized for both speed and performance on structured features. It generally provides stronger performance than Random Forests at significantly higher computational cost.</w:t>
+      </w:r>
+    </w:p>
+    <w:p>
+      <w:pPr>
+        <w:pStyle w:val="Heading3"/>
+      </w:pPr>
       <w:r>
         <w:rPr>
           <w:rStyle w:val="Strong"/>
           <w:b w:val="0"/>
           <w:bCs w:val="0"/>
         </w:rPr>
-        <w:t xml:space="preserve"> Classifier</w:t>
+        <w:t>Multilayer Perceptron (MLP)</w:t>
       </w:r>
     </w:p>
     <w:p>
@@ -2682,44 +2365,7 @@
         <w:ind w:left="360"/>
       </w:pPr>
       <w:r>
-        <w:t>A gradient-boosted decision tree model optimized for both speed and performance on structured features. It generally provides stronger performance than Random Forests at significantly higher computational cost.</w:t>
-      </w:r>
-    </w:p>
-    <w:p>
-      <w:pPr>
-        <w:pStyle w:val="Heading3"/>
-      </w:pPr>
-      <w:r>
-        <w:rPr>
-          <w:rStyle w:val="Strong"/>
-          <w:b w:val="0"/>
-          <w:bCs w:val="0"/>
-        </w:rPr>
-        <w:t>Multilayer Perceptron (MLP)</w:t>
-      </w:r>
-    </w:p>
-    <w:p>
-      <w:pPr>
-        <w:ind w:left="360"/>
-      </w:pPr>
-      <w:r>
-        <w:t xml:space="preserve">A feed-forward neural network trained on vectorized input features. The </w:t>
-      </w:r>
-      <w:proofErr w:type="spellStart"/>
-      <w:r>
-        <w:t>Keras</w:t>
-      </w:r>
-      <w:proofErr w:type="spellEnd"/>
-      <w:r>
-        <w:t xml:space="preserve">-based MLP uses dense layers with </w:t>
-      </w:r>
-      <w:proofErr w:type="spellStart"/>
-      <w:r>
-        <w:t>ReLU</w:t>
-      </w:r>
-      <w:proofErr w:type="spellEnd"/>
-      <w:r>
-        <w:t xml:space="preserve"> activation, dropout regularization, and Adam optimization.</w:t>
+        <w:t>A feed-forward neural network trained on vectorized input features. The Keras-based MLP uses dense layers with ReLU activation, dropout regularization, and Adam optimization.</w:t>
       </w:r>
     </w:p>
     <w:p>
@@ -2814,42 +2460,14 @@
         <w:rPr>
           <w:lang w:val="en-CA"/>
         </w:rPr>
-        <w:t xml:space="preserve">Using </w:t>
-      </w:r>
-      <w:proofErr w:type="spellStart"/>
-      <w:r>
-        <w:rPr>
-          <w:lang w:val="en-CA"/>
-        </w:rPr>
-        <w:t>Keras</w:t>
-      </w:r>
-      <w:proofErr w:type="spellEnd"/>
-      <w:r>
-        <w:rPr>
-          <w:lang w:val="en-CA"/>
-        </w:rPr>
-        <w:t>’ Embedding layer, each token index is mapped to a learnable dense vector. The sequence of embeddings is then aggregated (via pooling) and passed through dense layers for classification.</w:t>
+        <w:t>Using Keras’ Embedding layer, each token index is mapped to a learnable dense vector. The sequence of embeddings is then aggregated (via pooling) and passed through dense layers for classification.</w:t>
       </w:r>
       <w:r>
         <w:rPr>
           <w:lang w:val="en-CA"/>
         </w:rPr>
         <w:br/>
-        <w:t xml:space="preserve">This improves representational capacity over </w:t>
-      </w:r>
-      <w:proofErr w:type="spellStart"/>
-      <w:r>
-        <w:rPr>
-          <w:lang w:val="en-CA"/>
-        </w:rPr>
-        <w:t>BoW</w:t>
-      </w:r>
-      <w:proofErr w:type="spellEnd"/>
-      <w:r>
-        <w:rPr>
-          <w:lang w:val="en-CA"/>
-        </w:rPr>
-        <w:t xml:space="preserve"> and TF-IDF while remaining significantly lighter than Transformer models.</w:t>
+        <w:t>This improves representational capacity over BoW and TF-IDF while remaining significantly lighter than Transformer models.</w:t>
       </w:r>
     </w:p>
     <w:p>
@@ -3024,21 +2642,7 @@
         <w:rPr>
           <w:lang w:val="en-CA"/>
         </w:rPr>
-        <w:t xml:space="preserve">Tokenize input with </w:t>
-      </w:r>
-      <w:proofErr w:type="spellStart"/>
-      <w:r>
-        <w:rPr>
-          <w:lang w:val="en-CA"/>
-        </w:rPr>
-        <w:t>WordPiece</w:t>
-      </w:r>
-      <w:proofErr w:type="spellEnd"/>
-      <w:r>
-        <w:rPr>
-          <w:lang w:val="en-CA"/>
-        </w:rPr>
-        <w:t xml:space="preserve"> tokenizer</w:t>
+        <w:t>Tokenize input with WordPiece tokenizer</w:t>
       </w:r>
     </w:p>
     <w:p>
@@ -3074,35 +2678,7 @@
         <w:rPr>
           <w:lang w:val="en-CA"/>
         </w:rPr>
-        <w:t>Feed (</w:t>
-      </w:r>
-      <w:proofErr w:type="spellStart"/>
-      <w:r>
-        <w:rPr>
-          <w:lang w:val="en-CA"/>
-        </w:rPr>
-        <w:t>input_ids</w:t>
-      </w:r>
-      <w:proofErr w:type="spellEnd"/>
-      <w:r>
-        <w:rPr>
-          <w:lang w:val="en-CA"/>
-        </w:rPr>
-        <w:t xml:space="preserve">, </w:t>
-      </w:r>
-      <w:proofErr w:type="spellStart"/>
-      <w:r>
-        <w:rPr>
-          <w:lang w:val="en-CA"/>
-        </w:rPr>
-        <w:t>attention_mask</w:t>
-      </w:r>
-      <w:proofErr w:type="spellEnd"/>
-      <w:r>
-        <w:rPr>
-          <w:lang w:val="en-CA"/>
-        </w:rPr>
-        <w:t>) into the encoder</w:t>
+        <w:t>Feed (input_ids, attention_mask) into the encoder</w:t>
       </w:r>
     </w:p>
     <w:p>
@@ -3138,16 +2714,8 @@
         <w:rPr>
           <w:lang w:val="en-CA"/>
         </w:rPr>
-        <w:t xml:space="preserve">Pass through a dropout → dense layer → 4-class </w:t>
-      </w:r>
-      <w:proofErr w:type="spellStart"/>
-      <w:r>
-        <w:rPr>
-          <w:lang w:val="en-CA"/>
-        </w:rPr>
-        <w:t>softmax</w:t>
-      </w:r>
-      <w:proofErr w:type="spellEnd"/>
+        <w:t>Pass through a dropout → dense layer → 4-class softmax</w:t>
+      </w:r>
     </w:p>
     <w:p>
       <w:pPr>
@@ -3418,19 +2986,11 @@
           <w:lang w:val="en-CA"/>
         </w:rPr>
       </w:pPr>
-      <w:proofErr w:type="spellStart"/>
-      <w:r>
-        <w:rPr>
-          <w:lang w:val="en-CA"/>
-        </w:rPr>
-        <w:t>XGBoost</w:t>
-      </w:r>
-      <w:proofErr w:type="spellEnd"/>
-      <w:r>
-        <w:rPr>
-          <w:lang w:val="en-CA"/>
-        </w:rPr>
-        <w:t xml:space="preserve"> and Random Forest FLOPs</w:t>
+      <w:r>
+        <w:rPr>
+          <w:lang w:val="en-CA"/>
+        </w:rPr>
+        <w:t>XGBoost and Random Forest FLOPs</w:t>
       </w:r>
     </w:p>
     <w:p>
@@ -3855,35 +3415,7 @@
         <w:rPr>
           <w:lang w:val="en-CA"/>
         </w:rPr>
-        <w:t>Classical machine learning models (</w:t>
-      </w:r>
-      <w:proofErr w:type="spellStart"/>
-      <w:r>
-        <w:rPr>
-          <w:lang w:val="en-CA"/>
-        </w:rPr>
-        <w:t>BoW</w:t>
-      </w:r>
-      <w:proofErr w:type="spellEnd"/>
-      <w:r>
-        <w:rPr>
-          <w:lang w:val="en-CA"/>
-        </w:rPr>
-        <w:t xml:space="preserve">, TF-IDF, Logistic Regression, Random Forest, </w:t>
-      </w:r>
-      <w:proofErr w:type="spellStart"/>
-      <w:r>
-        <w:rPr>
-          <w:lang w:val="en-CA"/>
-        </w:rPr>
-        <w:t>XGBoost</w:t>
-      </w:r>
-      <w:proofErr w:type="spellEnd"/>
-      <w:r>
-        <w:rPr>
-          <w:lang w:val="en-CA"/>
-        </w:rPr>
-        <w:t>, Scratch-MLP) were executed on CPU.</w:t>
+        <w:t>Classical machine learning models (BoW, TF-IDF, Logistic Regression, Random Forest, XGBoost, Scratch-MLP) were executed on CPU.</w:t>
       </w:r>
     </w:p>
     <w:p>
@@ -4001,19 +3533,11 @@
           <w:lang w:val="en-CA"/>
         </w:rPr>
       </w:pPr>
-      <w:proofErr w:type="spellStart"/>
-      <w:r>
-        <w:rPr>
-          <w:lang w:val="en-CA"/>
-        </w:rPr>
-        <w:t>HuggingFace</w:t>
-      </w:r>
-      <w:proofErr w:type="spellEnd"/>
-      <w:r>
-        <w:rPr>
-          <w:lang w:val="en-CA"/>
-        </w:rPr>
-        <w:t xml:space="preserve"> Transformers: v4.x</w:t>
+      <w:r>
+        <w:rPr>
+          <w:lang w:val="en-CA"/>
+        </w:rPr>
+        <w:t>HuggingFace Transformers: v4.x</w:t>
       </w:r>
     </w:p>
     <w:p>
@@ -4045,19 +3569,11 @@
           <w:lang w:val="en-CA"/>
         </w:rPr>
       </w:pPr>
-      <w:proofErr w:type="spellStart"/>
-      <w:r>
-        <w:rPr>
-          <w:lang w:val="en-CA"/>
-        </w:rPr>
-        <w:t>XGBoost</w:t>
-      </w:r>
-      <w:proofErr w:type="spellEnd"/>
-      <w:r>
-        <w:rPr>
-          <w:lang w:val="en-CA"/>
-        </w:rPr>
-        <w:t>: GPU/CPU hybrid execution</w:t>
+      <w:r>
+        <w:rPr>
+          <w:lang w:val="en-CA"/>
+        </w:rPr>
+        <w:t>XGBoost: GPU/CPU hybrid execution</w:t>
       </w:r>
     </w:p>
     <w:p>
@@ -4071,19 +3587,11 @@
           <w:lang w:val="en-CA"/>
         </w:rPr>
       </w:pPr>
-      <w:proofErr w:type="spellStart"/>
-      <w:r>
-        <w:rPr>
-          <w:lang w:val="en-CA"/>
-        </w:rPr>
-        <w:t>Gensim</w:t>
-      </w:r>
-      <w:proofErr w:type="spellEnd"/>
-      <w:r>
-        <w:rPr>
-          <w:lang w:val="en-CA"/>
-        </w:rPr>
-        <w:t>: For Word2Vec (when applicable)</w:t>
+      <w:r>
+        <w:rPr>
+          <w:lang w:val="en-CA"/>
+        </w:rPr>
+        <w:t>Gensim: For Word2Vec (when applicable)</w:t>
       </w:r>
     </w:p>
     <w:p>
@@ -4115,19 +3623,11 @@
           <w:lang w:val="en-CA"/>
         </w:rPr>
       </w:pPr>
-      <w:proofErr w:type="spellStart"/>
-      <w:r>
-        <w:rPr>
-          <w:lang w:val="en-CA"/>
-        </w:rPr>
-        <w:t>HuggingFace</w:t>
-      </w:r>
-      <w:proofErr w:type="spellEnd"/>
-      <w:r>
-        <w:rPr>
-          <w:lang w:val="en-CA"/>
-        </w:rPr>
-        <w:t xml:space="preserve"> Datasets: For AG News loading and preprocessing</w:t>
+      <w:r>
+        <w:rPr>
+          <w:lang w:val="en-CA"/>
+        </w:rPr>
+        <w:t>HuggingFace Datasets: For AG News loading and preprocessing</w:t>
       </w:r>
     </w:p>
     <w:p>
@@ -4208,21 +3708,7 @@
         <w:rPr>
           <w:lang w:val="en-CA"/>
         </w:rPr>
-        <w:t xml:space="preserve">: </w:t>
-      </w:r>
-      <w:proofErr w:type="spellStart"/>
-      <w:r>
-        <w:rPr>
-          <w:lang w:val="en-CA"/>
-        </w:rPr>
-        <w:t>max_iter</w:t>
-      </w:r>
-      <w:proofErr w:type="spellEnd"/>
-      <w:r>
-        <w:rPr>
-          <w:lang w:val="en-CA"/>
-        </w:rPr>
-        <w:t xml:space="preserve"> = 1000, One-vs-Rest classification</w:t>
+        <w:t>: max_iter = 1000, One-vs-Rest classification</w:t>
       </w:r>
     </w:p>
     <w:p>
@@ -4248,35 +3734,7 @@
         <w:rPr>
           <w:lang w:val="en-CA"/>
         </w:rPr>
-        <w:t xml:space="preserve">: 100 estimators, </w:t>
-      </w:r>
-      <w:proofErr w:type="spellStart"/>
-      <w:r>
-        <w:rPr>
-          <w:lang w:val="en-CA"/>
-        </w:rPr>
-        <w:t>max_depth</w:t>
-      </w:r>
-      <w:proofErr w:type="spellEnd"/>
-      <w:r>
-        <w:rPr>
-          <w:lang w:val="en-CA"/>
-        </w:rPr>
-        <w:t xml:space="preserve"> = 10, </w:t>
-      </w:r>
-      <w:proofErr w:type="spellStart"/>
-      <w:r>
-        <w:rPr>
-          <w:lang w:val="en-CA"/>
-        </w:rPr>
-        <w:t>n_jobs</w:t>
-      </w:r>
-      <w:proofErr w:type="spellEnd"/>
-      <w:r>
-        <w:rPr>
-          <w:lang w:val="en-CA"/>
-        </w:rPr>
-        <w:t xml:space="preserve"> = -1</w:t>
+        <w:t>: 100 estimators, max_depth = 10, n_jobs = -1</w:t>
       </w:r>
     </w:p>
     <w:p>
@@ -4290,7 +3748,6 @@
           <w:lang w:val="en-CA"/>
         </w:rPr>
       </w:pPr>
-      <w:proofErr w:type="spellStart"/>
       <w:r>
         <w:rPr>
           <w:b/>
@@ -4299,7 +3756,6 @@
         </w:rPr>
         <w:t>XGBoost</w:t>
       </w:r>
-      <w:proofErr w:type="spellEnd"/>
       <w:r>
         <w:rPr>
           <w:lang w:val="en-CA"/>
@@ -4324,45 +3780,13 @@
           <w:bCs/>
           <w:lang w:val="en-CA"/>
         </w:rPr>
-        <w:t>MLP (</w:t>
-      </w:r>
-      <w:proofErr w:type="spellStart"/>
-      <w:r>
-        <w:rPr>
-          <w:b/>
-          <w:bCs/>
-          <w:lang w:val="en-CA"/>
-        </w:rPr>
-        <w:t>Keras</w:t>
-      </w:r>
-      <w:proofErr w:type="spellEnd"/>
-      <w:r>
-        <w:rPr>
-          <w:b/>
-          <w:bCs/>
-          <w:lang w:val="en-CA"/>
-        </w:rPr>
-        <w:t>):</w:t>
-      </w:r>
-      <w:r>
-        <w:rPr>
-          <w:lang w:val="en-CA"/>
-        </w:rPr>
-        <w:t xml:space="preserve"> Dense layers with 256–512 neurons, </w:t>
-      </w:r>
-      <w:proofErr w:type="spellStart"/>
-      <w:r>
-        <w:rPr>
-          <w:lang w:val="en-CA"/>
-        </w:rPr>
-        <w:t>ReLU</w:t>
-      </w:r>
-      <w:proofErr w:type="spellEnd"/>
-      <w:r>
-        <w:rPr>
-          <w:lang w:val="en-CA"/>
-        </w:rPr>
-        <w:t xml:space="preserve"> activations, dropout regularization</w:t>
+        <w:t>MLP (Keras):</w:t>
+      </w:r>
+      <w:r>
+        <w:rPr>
+          <w:lang w:val="en-CA"/>
+        </w:rPr>
+        <w:t xml:space="preserve"> Dense layers with 256–512 neurons, ReLU activations, dropout regularization</w:t>
       </w:r>
     </w:p>
     <w:p>
@@ -4432,21 +3856,7 @@
         <w:rPr>
           <w:lang w:val="en-CA"/>
         </w:rPr>
-        <w:t xml:space="preserve"> </w:t>
-      </w:r>
-      <w:proofErr w:type="spellStart"/>
-      <w:r>
-        <w:rPr>
-          <w:lang w:val="en-CA"/>
-        </w:rPr>
-        <w:t>BoW</w:t>
-      </w:r>
-      <w:proofErr w:type="spellEnd"/>
-      <w:r>
-        <w:rPr>
-          <w:lang w:val="en-CA"/>
-        </w:rPr>
-        <w:t xml:space="preserve"> or TF-IDF vectors.</w:t>
+        <w:t xml:space="preserve"> BoW or TF-IDF vectors.</w:t>
       </w:r>
     </w:p>
     <w:p>
@@ -4662,21 +4072,7 @@
         <w:rPr>
           <w:lang w:val="en-CA"/>
         </w:rPr>
-        <w:t xml:space="preserve"> </w:t>
-      </w:r>
-      <w:proofErr w:type="spellStart"/>
-      <w:r>
-        <w:rPr>
-          <w:lang w:val="en-CA"/>
-        </w:rPr>
-        <w:t>bert</w:t>
-      </w:r>
-      <w:proofErr w:type="spellEnd"/>
-      <w:r>
-        <w:rPr>
-          <w:lang w:val="en-CA"/>
-        </w:rPr>
-        <w:t>-base-uncased</w:t>
+        <w:t xml:space="preserve"> bert-base-uncased</w:t>
       </w:r>
     </w:p>
     <w:p>
@@ -4780,16 +4176,8 @@
         <w:rPr>
           <w:lang w:val="en-CA"/>
         </w:rPr>
-        <w:t xml:space="preserve"> </w:t>
-      </w:r>
-      <w:proofErr w:type="spellStart"/>
-      <w:r>
-        <w:rPr>
-          <w:lang w:val="en-CA"/>
-        </w:rPr>
-        <w:t>AdamW</w:t>
-      </w:r>
-      <w:proofErr w:type="spellEnd"/>
+        <w:t xml:space="preserve"> AdamW</w:t>
+      </w:r>
     </w:p>
     <w:p>
       <w:pPr>
@@ -4840,21 +4228,7 @@
         <w:rPr>
           <w:lang w:val="en-CA"/>
         </w:rPr>
-        <w:t xml:space="preserve"> All encoder layers trainable, CLS token → dense → </w:t>
-      </w:r>
-      <w:proofErr w:type="spellStart"/>
-      <w:r>
-        <w:rPr>
-          <w:lang w:val="en-CA"/>
-        </w:rPr>
-        <w:t>softmax</w:t>
-      </w:r>
-      <w:proofErr w:type="spellEnd"/>
-      <w:r>
-        <w:rPr>
-          <w:lang w:val="en-CA"/>
-        </w:rPr>
-        <w:t xml:space="preserve"> head</w:t>
+        <w:t xml:space="preserve"> All encoder layers trainable, CLS token → dense → softmax head</w:t>
       </w:r>
     </w:p>
     <w:p>
@@ -4874,7 +4248,6 @@
         </w:rPr>
         <w:t xml:space="preserve">Distributed training used TensorFlow’s </w:t>
       </w:r>
-      <w:proofErr w:type="spellStart"/>
       <w:r>
         <w:rPr>
           <w:b/>
@@ -4883,19 +4256,11 @@
         </w:rPr>
         <w:t>MirroredStrategy</w:t>
       </w:r>
-      <w:proofErr w:type="spellEnd"/>
-      <w:r>
-        <w:rPr>
-          <w:lang w:val="en-CA"/>
-        </w:rPr>
-        <w:t xml:space="preserve">, enabling two Tesla T4 GPUs to train in </w:t>
-      </w:r>
-      <w:proofErr w:type="gramStart"/>
-      <w:r>
-        <w:rPr>
-          <w:lang w:val="en-CA"/>
-        </w:rPr>
-        <w:t>parallel</w:t>
+      <w:r>
+        <w:rPr>
+          <w:lang w:val="en-CA"/>
+        </w:rPr>
+        <w:t>, enabling two Tesla T4 GPUs to train in parallel</w:t>
       </w:r>
       <w:r>
         <w:rPr>
@@ -4907,14 +4272,7 @@
         <w:rPr>
           <w:lang w:val="en-CA"/>
         </w:rPr>
-        <w:t>,</w:t>
-      </w:r>
-      <w:proofErr w:type="gramEnd"/>
-      <w:r>
-        <w:rPr>
-          <w:lang w:val="en-CA"/>
-        </w:rPr>
-        <w:t xml:space="preserve"> Used Kaggle Cloud Notebook.</w:t>
+        <w:t>, Used Kaggle Cloud Notebook.</w:t>
       </w:r>
       <w:r>
         <w:rPr>
@@ -5282,23 +4640,13 @@
         <w:br/>
         <w:t xml:space="preserve">The dataset was loaded directly from the </w:t>
       </w:r>
-      <w:proofErr w:type="spellStart"/>
       <w:r>
         <w:rPr>
           <w:b/>
           <w:bCs/>
           <w:lang w:val="en-CA"/>
         </w:rPr>
-        <w:t>HuggingFace</w:t>
-      </w:r>
-      <w:proofErr w:type="spellEnd"/>
-      <w:r>
-        <w:rPr>
-          <w:b/>
-          <w:bCs/>
-          <w:lang w:val="en-CA"/>
-        </w:rPr>
-        <w:t xml:space="preserve"> Datasets Hub</w:t>
+        <w:t>HuggingFace Datasets Hub</w:t>
       </w:r>
       <w:r>
         <w:rPr>
@@ -5412,21 +4760,7 @@
         <w:rPr>
           <w:lang w:val="en-CA"/>
         </w:rPr>
-        <w:t>Model category (</w:t>
-      </w:r>
-      <w:proofErr w:type="spellStart"/>
-      <w:r>
-        <w:rPr>
-          <w:lang w:val="en-CA"/>
-        </w:rPr>
-        <w:t>BoW</w:t>
-      </w:r>
-      <w:proofErr w:type="spellEnd"/>
-      <w:r>
-        <w:rPr>
-          <w:lang w:val="en-CA"/>
-        </w:rPr>
-        <w:t>, TF-IDF, Word2Vec, MLP, BERT)</w:t>
+        <w:t>Model category (BoW, TF-IDF, Word2Vec, MLP, BERT)</w:t>
       </w:r>
     </w:p>
     <w:p>
@@ -5463,23 +4797,7 @@
           <w:rFonts w:asciiTheme="majorBidi" w:hAnsiTheme="majorBidi" w:cstheme="majorBidi"/>
           <w:lang w:val="en-CA" w:eastAsia="zh-CN"/>
         </w:rPr>
-        <w:t>This section presents the comparative performance of all models evaluated in this study, spanning classical machine-learning models (</w:t>
-      </w:r>
-      <w:proofErr w:type="spellStart"/>
-      <w:r>
-        <w:rPr>
-          <w:rFonts w:asciiTheme="majorBidi" w:hAnsiTheme="majorBidi" w:cstheme="majorBidi"/>
-          <w:lang w:val="en-CA" w:eastAsia="zh-CN"/>
-        </w:rPr>
-        <w:t>BoW</w:t>
-      </w:r>
-      <w:proofErr w:type="spellEnd"/>
-      <w:r>
-        <w:rPr>
-          <w:rFonts w:asciiTheme="majorBidi" w:hAnsiTheme="majorBidi" w:cstheme="majorBidi"/>
-          <w:lang w:val="en-CA" w:eastAsia="zh-CN"/>
-        </w:rPr>
-        <w:t>/TF–IDF), embedding-based deep networks, Word2Vec-based architectures, and transformer-based models (BERT and multi-GPU BERT). All results are derived from the consolidated metrics recorded in results.csv.</w:t>
+        <w:t>This section presents the comparative performance of all models evaluated in this study, spanning classical machine-learning models (BoW/TF–IDF), embedding-based deep networks, Word2Vec-based architectures, and transformer-based models (BERT and multi-GPU BERT). All results are derived from the consolidated metrics recorded in results.csv.</w:t>
       </w:r>
     </w:p>
     <w:p>
@@ -5503,17 +4821,7 @@
           <w:iCs/>
           <w:lang w:val="en-CA" w:eastAsia="zh-CN"/>
         </w:rPr>
-        <w:t xml:space="preserve">From First Principles to </w:t>
-      </w:r>
-      <w:proofErr w:type="gramStart"/>
-      <w:r>
-        <w:rPr>
-          <w:rFonts w:asciiTheme="majorBidi" w:hAnsiTheme="majorBidi" w:cstheme="majorBidi"/>
-          <w:i/>
-          <w:iCs/>
-          <w:lang w:val="en-CA" w:eastAsia="zh-CN"/>
-        </w:rPr>
-        <w:t>Transformers</w:t>
+        <w:t>From First Principles to Transformers</w:t>
       </w:r>
       <w:r>
         <w:rPr>
@@ -5522,7 +4830,6 @@
         </w:rPr>
         <w:t xml:space="preserve"> .</w:t>
       </w:r>
-      <w:proofErr w:type="gramEnd"/>
     </w:p>
     <w:p>
       <w:pPr>
@@ -5552,13 +4859,7 @@
         <w:rPr>
           <w:lang w:val="en-CA" w:eastAsia="zh-CN"/>
         </w:rPr>
-        <w:t>T</w:t>
-      </w:r>
-      <w:r>
-        <w:rPr>
-          <w:lang w:val="en-CA" w:eastAsia="zh-CN"/>
-        </w:rPr>
-        <w:t>able 1 summarizes the performance of all models evaluated on the AG News dataset. While interpreting the results, it is important to note that the accuracy of each model can differ between the training and testing sets. During experimentation, the primary objective was not to maximize absolute accuracy for any single model, but rather to maintain comparable accuracy levels across models. This allows for a fairer and more controlled comparison of engineering-relevant metrics such as FLOPs, training time, and inference time.</w:t>
+        <w:t>Table 1 summarizes the performance of all models evaluated on the AG News dataset. While interpreting the results, it is important to note that the accuracy of each model can differ between the training and testing sets. During experimentation, the primary objective was not to maximize absolute accuracy for any single model, but rather to maintain comparable accuracy levels across models. This allows for a fairer and more controlled comparison of engineering-relevant metrics such as FLOPs, training time, and inference time.</w:t>
       </w:r>
     </w:p>
     <w:p>
@@ -5630,7 +4931,10 @@
         <w:t>TF-IDF + Logistic Regression</w:t>
       </w:r>
       <w:r>
-        <w:t xml:space="preserve"> (0.906). These results demonstrate that high performance can be achieved without transformers, especially when leveraging learned embeddings or dense neural architectures.</w:t>
+        <w:t xml:space="preserve"> (0.906). These results demonstrate that </w:t>
+      </w:r>
+      <w:r>
+        <w:t>high performance can be achieved without transformers, especially when leveraging learned embeddings or dense neural architectures.</w:t>
       </w:r>
     </w:p>
     <w:p>
@@ -5688,55 +4992,7 @@
     </w:p>
     <w:p>
       <w:r>
-        <w:t xml:space="preserve">But it </w:t>
-      </w:r>
-      <w:proofErr w:type="gramStart"/>
-      <w:r>
-        <w:t>would</w:t>
-      </w:r>
-      <w:proofErr w:type="gramEnd"/>
-      <w:r>
-        <w:t xml:space="preserve"> </w:t>
-      </w:r>
-      <w:proofErr w:type="gramStart"/>
-      <w:r>
-        <w:t>partial</w:t>
-      </w:r>
-      <w:proofErr w:type="gramEnd"/>
-      <w:r>
-        <w:t xml:space="preserve"> to say that the BERT Model underperformed as it is well known that the transformer models </w:t>
-      </w:r>
-      <w:proofErr w:type="gramStart"/>
-      <w:r>
-        <w:t>needs</w:t>
-      </w:r>
-      <w:proofErr w:type="gramEnd"/>
-      <w:r>
-        <w:t xml:space="preserve"> very large </w:t>
-      </w:r>
-      <w:proofErr w:type="gramStart"/>
-      <w:r>
-        <w:t>dataset(</w:t>
-      </w:r>
-      <w:proofErr w:type="gramEnd"/>
-      <w:r>
-        <w:t xml:space="preserve">Terabytes or Petabytes) to train on and large number of epochs. But this type of model </w:t>
-      </w:r>
-      <w:proofErr w:type="gramStart"/>
-      <w:r>
-        <w:t>become</w:t>
-      </w:r>
-      <w:proofErr w:type="gramEnd"/>
-      <w:r>
-        <w:t xml:space="preserve"> very helpful if the classification is on 100’s or even 1000’s target </w:t>
-      </w:r>
-      <w:proofErr w:type="gramStart"/>
-      <w:r>
-        <w:t>variables ,</w:t>
-      </w:r>
-      <w:proofErr w:type="gramEnd"/>
-      <w:r>
-        <w:t xml:space="preserve"> where our classic ML Models and MLP or CNN models lack. </w:t>
+        <w:t xml:space="preserve">But it would partial to say that the BERT Model underperformed as it is well known that the transformer models needs very large dataset(Terabytes or Petabytes) to train on and large number of epochs. But this type of model become very helpful if the classification is on 100’s or even 1000’s target variables , where our classic ML Models and MLP or CNN models lack. </w:t>
       </w:r>
     </w:p>
     <w:p>
@@ -6983,14 +6239,12 @@
                 <w:lang w:val="en-CA"/>
               </w:rPr>
             </w:pPr>
-            <w:proofErr w:type="spellStart"/>
             <w:r>
               <w:rPr>
                 <w:lang w:val="en-CA"/>
               </w:rPr>
               <w:t>Tf_IDF</w:t>
             </w:r>
-            <w:proofErr w:type="spellEnd"/>
           </w:p>
         </w:tc>
         <w:tc>
@@ -7150,14 +6404,12 @@
                 <w:lang w:val="en-CA"/>
               </w:rPr>
             </w:pPr>
-            <w:proofErr w:type="spellStart"/>
             <w:r>
               <w:rPr>
                 <w:lang w:val="en-CA"/>
               </w:rPr>
               <w:t>Tf_IDF</w:t>
             </w:r>
-            <w:proofErr w:type="spellEnd"/>
           </w:p>
         </w:tc>
         <w:tc>
@@ -7314,14 +6566,12 @@
                 <w:lang w:val="en-CA"/>
               </w:rPr>
             </w:pPr>
-            <w:proofErr w:type="spellStart"/>
             <w:r>
               <w:rPr>
                 <w:lang w:val="en-CA"/>
               </w:rPr>
               <w:t>Tf_IDF</w:t>
             </w:r>
-            <w:proofErr w:type="spellEnd"/>
           </w:p>
         </w:tc>
         <w:tc>
@@ -7481,14 +6731,12 @@
                 <w:lang w:val="en-CA"/>
               </w:rPr>
             </w:pPr>
-            <w:proofErr w:type="spellStart"/>
             <w:r>
               <w:rPr>
                 <w:lang w:val="en-CA"/>
               </w:rPr>
               <w:t>Tf_IDF</w:t>
             </w:r>
-            <w:proofErr w:type="spellEnd"/>
           </w:p>
         </w:tc>
         <w:tc>
@@ -7645,14 +6893,12 @@
                 <w:lang w:val="en-CA"/>
               </w:rPr>
             </w:pPr>
-            <w:proofErr w:type="spellStart"/>
             <w:r>
               <w:rPr>
                 <w:lang w:val="en-CA"/>
               </w:rPr>
               <w:t>Tf_IDF</w:t>
             </w:r>
-            <w:proofErr w:type="spellEnd"/>
           </w:p>
         </w:tc>
         <w:tc>
@@ -9014,7 +8260,20 @@
         <w:rPr>
           <w:lang w:val="en-CA"/>
         </w:rPr>
-        <w:t>The results in Section VII highlight important insights into the behavior, strengths, and limitations of different NLP architectures across the classical–to–transformer spectrum. Classical machine-learning models such as Logistic Regression and MLPs trained on sparse TF–IDF or Bag-of-Words vectors demonstrated strong performance (≈90–91% test accuracy) at extremely low computational cost. Deep embedding and Word2Vec-based CNN models further improved accuracy by capturing semantic structure, achieving up to 0.914 test accuracy. In contrast, the BERT Transformer model achieved a lower test accuracy of 0.887 in this experiment. However, it would be partial and technically inaccurate to conclude that the BERT model inherently underperforms.</w:t>
+        <w:t xml:space="preserve">The results in Section VII highlight important insights into the behavior, strengths, and limitations of </w:t>
+      </w:r>
+      <w:r>
+        <w:rPr>
+          <w:lang w:val="en-CA"/>
+        </w:rPr>
+        <w:t xml:space="preserve">different NLP architectures across the classical–to–transformer spectrum. Classical machine-learning models such as Logistic Regression and MLPs trained on sparse TF–IDF or Bag-of-Words vectors demonstrated strong performance (≈90–91% test </w:t>
+      </w:r>
+      <w:r>
+        <w:rPr>
+          <w:lang w:val="en-CA"/>
+        </w:rPr>
+        <w:lastRenderedPageBreak/>
+        <w:t>accuracy) at extremely low computational cost. Deep embedding and Word2Vec-based CNN models further improved accuracy by capturing semantic structure, achieving up to 0.914 test accuracy. In contrast, the BERT Transformer model achieved a lower test accuracy of 0.887 in this experiment. However, it would be partial and technically inaccurate to conclude that the BERT model inherently underperforms.</w:t>
       </w:r>
     </w:p>
     <w:p>
@@ -9053,21 +8312,13 @@
         <w:rPr>
           <w:lang w:val="en-CA"/>
         </w:rPr>
-        <w:t xml:space="preserve">The strong performance of classical and embedding-based methods in this project is therefore unsurprising. In low-dimensional output settings with moderately sized datasets, these models offer fast training, efficient inference, and very competitive accuracy. Their low FLOPs and smaller parameter </w:t>
-      </w:r>
-      <w:proofErr w:type="gramStart"/>
-      <w:r>
-        <w:rPr>
-          <w:lang w:val="en-CA"/>
-        </w:rPr>
-        <w:t>counts</w:t>
-      </w:r>
-      <w:proofErr w:type="gramEnd"/>
-      <w:r>
-        <w:rPr>
-          <w:lang w:val="en-CA"/>
-        </w:rPr>
-        <w:t xml:space="preserve"> make them more suitable for edge devices, embedded systems, and compute-limited environments—an important consideration for engineering applications emphasized throughout the proposal </w:t>
+        <w:t xml:space="preserve">The strong performance of classical and embedding-based methods in this project is therefore unsurprising. In low-dimensional output settings with moderately sized datasets, these models offer fast training, efficient inference, and very competitive accuracy. Their low FLOPs and smaller parameter counts make them more suitable for edge devices, embedded </w:t>
+      </w:r>
+      <w:r>
+        <w:rPr>
+          <w:lang w:val="en-CA"/>
+        </w:rPr>
+        <w:t xml:space="preserve">systems, and compute-limited environments—an important consideration for engineering applications emphasized throughout the proposal </w:t>
       </w:r>
       <w:r>
         <w:rPr>
@@ -9204,35 +8455,7 @@
         <w:rPr>
           <w:lang w:val="en-CA"/>
         </w:rPr>
-        <w:t xml:space="preserve">Models such as </w:t>
-      </w:r>
-      <w:proofErr w:type="spellStart"/>
-      <w:r>
-        <w:rPr>
-          <w:lang w:val="en-CA"/>
-        </w:rPr>
-        <w:t>RoBERTa</w:t>
-      </w:r>
-      <w:proofErr w:type="spellEnd"/>
-      <w:r>
-        <w:rPr>
-          <w:lang w:val="en-CA"/>
-        </w:rPr>
-        <w:t xml:space="preserve">, </w:t>
-      </w:r>
-      <w:proofErr w:type="spellStart"/>
-      <w:r>
-        <w:rPr>
-          <w:lang w:val="en-CA"/>
-        </w:rPr>
-        <w:t>DistilBERT</w:t>
-      </w:r>
-      <w:proofErr w:type="spellEnd"/>
-      <w:r>
-        <w:rPr>
-          <w:lang w:val="en-CA"/>
-        </w:rPr>
-        <w:t>, ALBERT, or ELECTRA may offer better accuracy–efficiency trade-offs.</w:t>
+        <w:t>Models such as RoBERTa, DistilBERT, ALBERT, or ELECTRA may offer better accuracy–efficiency trade-offs.</w:t>
       </w:r>
     </w:p>
     <w:p>
@@ -9312,49 +8535,7 @@
         <w:rPr>
           <w:lang w:val="en-CA"/>
         </w:rPr>
-        <w:t xml:space="preserve">Given the edge-focused nature of the project, architectures such as </w:t>
-      </w:r>
-      <w:proofErr w:type="spellStart"/>
-      <w:r>
-        <w:rPr>
-          <w:lang w:val="en-CA"/>
-        </w:rPr>
-        <w:t>MobileBERT</w:t>
-      </w:r>
-      <w:proofErr w:type="spellEnd"/>
-      <w:r>
-        <w:rPr>
-          <w:lang w:val="en-CA"/>
-        </w:rPr>
-        <w:t xml:space="preserve">, </w:t>
-      </w:r>
-      <w:proofErr w:type="spellStart"/>
-      <w:r>
-        <w:rPr>
-          <w:lang w:val="en-CA"/>
-        </w:rPr>
-        <w:t>TinyBERT</w:t>
-      </w:r>
-      <w:proofErr w:type="spellEnd"/>
-      <w:r>
-        <w:rPr>
-          <w:lang w:val="en-CA"/>
-        </w:rPr>
-        <w:t xml:space="preserve">, and </w:t>
-      </w:r>
-      <w:proofErr w:type="spellStart"/>
-      <w:r>
-        <w:rPr>
-          <w:lang w:val="en-CA"/>
-        </w:rPr>
-        <w:t>DistilBERT</w:t>
-      </w:r>
-      <w:proofErr w:type="spellEnd"/>
-      <w:r>
-        <w:rPr>
-          <w:lang w:val="en-CA"/>
-        </w:rPr>
-        <w:t xml:space="preserve"> would provide practical insights on deploying transformers in embedded environments.</w:t>
+        <w:t>Given the edge-focused nature of the project, architectures such as MobileBERT, TinyBERT, and DistilBERT would provide practical insights on deploying transformers in embedded environments.</w:t>
       </w:r>
     </w:p>
     <w:p>
@@ -9419,7 +8600,14 @@
         <w:rPr>
           <w:lang w:val="en-CA"/>
         </w:rPr>
-        <w:t>remain unmatched due to their ability to leverage deep contextualized embeddings and long-range dependency modeling. A balanced understanding of these trade-offs is essential for selecting the appropriate architecture for real-world engineering applications.</w:t>
+        <w:t xml:space="preserve">remain </w:t>
+      </w:r>
+      <w:r>
+        <w:rPr>
+          <w:lang w:val="en-CA"/>
+        </w:rPr>
+        <w:lastRenderedPageBreak/>
+        <w:t>unmatched due to their ability to leverage deep contextualized embeddings and long-range dependency modeling. A balanced understanding of these trade-offs is essential for selecting the appropriate architecture for real-world engineering applications.</w:t>
       </w:r>
     </w:p>
     <w:p>
@@ -9486,7 +8674,13 @@
         <w:rPr>
           <w:lang w:val="en-CA" w:eastAsia="zh-CN"/>
         </w:rPr>
-        <w:t>The results underscore an important engineering insight: model selection is fundamentally a trade-off between accuracy, computational efficiency, and deployment constraints. Classical models remain highly competitive for small to mid-sized tasks, deep learning models with learned embeddings provide better representational power at reasonable cost, and transformers offer unparalleled capability in large-label or large-corpus scenarios at the expense of higher resource usage.</w:t>
+        <w:t xml:space="preserve">The results underscore an important engineering insight: model selection is fundamentally a trade-off between accuracy, computational efficiency, and deployment constraints. Classical models remain highly competitive for small to mid-sized tasks, deep </w:t>
+      </w:r>
+      <w:r>
+        <w:rPr>
+          <w:lang w:val="en-CA" w:eastAsia="zh-CN"/>
+        </w:rPr>
+        <w:t>learning models with learned embeddings provide better representational power at reasonable cost, and transformers offer unparalleled capability in large-label or large-corpus scenarios at the expense of higher resource usage.</w:t>
       </w:r>
     </w:p>
     <w:p>
@@ -9530,29 +8724,7 @@
           <w:szCs w:val="24"/>
           <w:lang w:val="en-CA" w:eastAsia="zh-CN"/>
         </w:rPr>
-        <w:t xml:space="preserve">[1] D. </w:t>
-      </w:r>
-      <w:proofErr w:type="spellStart"/>
-      <w:r>
-        <w:rPr>
-          <w:rFonts w:eastAsia="Times New Roman"/>
-          <w:color w:val="auto"/>
-          <w:sz w:val="24"/>
-          <w:szCs w:val="24"/>
-          <w:lang w:val="en-CA" w:eastAsia="zh-CN"/>
-        </w:rPr>
-        <w:t>Jurafsky</w:t>
-      </w:r>
-      <w:proofErr w:type="spellEnd"/>
-      <w:r>
-        <w:rPr>
-          <w:rFonts w:eastAsia="Times New Roman"/>
-          <w:color w:val="auto"/>
-          <w:sz w:val="24"/>
-          <w:szCs w:val="24"/>
-          <w:lang w:val="en-CA" w:eastAsia="zh-CN"/>
-        </w:rPr>
-        <w:t xml:space="preserve"> and J. H. Martin, </w:t>
+        <w:t xml:space="preserve">[1] D. Jurafsky and J. H. Martin, </w:t>
       </w:r>
       <w:r>
         <w:rPr>
@@ -9642,29 +8814,7 @@
           <w:szCs w:val="24"/>
           <w:lang w:val="en-CA" w:eastAsia="zh-CN"/>
         </w:rPr>
-        <w:t xml:space="preserve">[3] B. </w:t>
-      </w:r>
-      <w:proofErr w:type="spellStart"/>
-      <w:r>
-        <w:rPr>
-          <w:rFonts w:eastAsia="Times New Roman"/>
-          <w:color w:val="auto"/>
-          <w:sz w:val="24"/>
-          <w:szCs w:val="24"/>
-          <w:lang w:val="en-CA" w:eastAsia="zh-CN"/>
-        </w:rPr>
-        <w:t>Widrow</w:t>
-      </w:r>
-      <w:proofErr w:type="spellEnd"/>
-      <w:r>
-        <w:rPr>
-          <w:rFonts w:eastAsia="Times New Roman"/>
-          <w:color w:val="auto"/>
-          <w:sz w:val="24"/>
-          <w:szCs w:val="24"/>
-          <w:lang w:val="en-CA" w:eastAsia="zh-CN"/>
-        </w:rPr>
-        <w:t xml:space="preserve"> and M. Hoff, “Adaptive Switching Circuits,” </w:t>
+        <w:t xml:space="preserve">[3] B. Widrow and M. Hoff, “Adaptive Switching Circuits,” </w:t>
       </w:r>
       <w:r>
         <w:rPr>
@@ -9709,29 +8859,7 @@
           <w:szCs w:val="24"/>
           <w:lang w:val="en-CA" w:eastAsia="zh-CN"/>
         </w:rPr>
-        <w:t xml:space="preserve">[4] S. Hochreiter and J. </w:t>
-      </w:r>
-      <w:proofErr w:type="spellStart"/>
-      <w:r>
-        <w:rPr>
-          <w:rFonts w:eastAsia="Times New Roman"/>
-          <w:color w:val="auto"/>
-          <w:sz w:val="24"/>
-          <w:szCs w:val="24"/>
-          <w:lang w:val="en-CA" w:eastAsia="zh-CN"/>
-        </w:rPr>
-        <w:t>Schmidhuber</w:t>
-      </w:r>
-      <w:proofErr w:type="spellEnd"/>
-      <w:r>
-        <w:rPr>
-          <w:rFonts w:eastAsia="Times New Roman"/>
-          <w:color w:val="auto"/>
-          <w:sz w:val="24"/>
-          <w:szCs w:val="24"/>
-          <w:lang w:val="en-CA" w:eastAsia="zh-CN"/>
-        </w:rPr>
-        <w:t xml:space="preserve">, “Long Short-Term Memory,” </w:t>
+        <w:t xml:space="preserve">[4] S. Hochreiter and J. Schmidhuber, “Long Short-Term Memory,” </w:t>
       </w:r>
       <w:r>
         <w:rPr>
@@ -9810,9 +8938,62 @@
           <w:szCs w:val="24"/>
           <w:lang w:val="en-CA" w:eastAsia="zh-CN"/>
         </w:rPr>
-        <w:t>Advances in Neural Information Processing Systems (</w:t>
-      </w:r>
-      <w:proofErr w:type="spellStart"/>
+        <w:t>Advances in Neural Information Processing Systems (NeurIPS)</w:t>
+      </w:r>
+      <w:r>
+        <w:rPr>
+          <w:rFonts w:eastAsia="Times New Roman"/>
+          <w:color w:val="auto"/>
+          <w:sz w:val="24"/>
+          <w:szCs w:val="24"/>
+          <w:lang w:val="en-CA" w:eastAsia="zh-CN"/>
+        </w:rPr>
+        <w:t>, 2017.</w:t>
+      </w:r>
+    </w:p>
+    <w:p>
+      <w:pPr>
+        <w:spacing w:before="100" w:beforeAutospacing="1" w:after="100" w:afterAutospacing="1" w:line="240" w:lineRule="auto"/>
+        <w:jc w:val="left"/>
+        <w:rPr>
+          <w:rFonts w:eastAsia="Times New Roman"/>
+          <w:color w:val="auto"/>
+          <w:sz w:val="24"/>
+          <w:szCs w:val="24"/>
+          <w:lang w:val="en-CA" w:eastAsia="zh-CN"/>
+        </w:rPr>
+      </w:pPr>
+      <w:r>
+        <w:rPr>
+          <w:rFonts w:eastAsia="Times New Roman"/>
+          <w:color w:val="auto"/>
+          <w:sz w:val="24"/>
+          <w:szCs w:val="24"/>
+          <w:lang w:val="en-CA" w:eastAsia="zh-CN"/>
+        </w:rPr>
+        <w:t>[6] A. Minaee, S. Minaei, and J. Zhu,</w:t>
+      </w:r>
+      <w:r>
+        <w:rPr>
+          <w:rFonts w:eastAsia="Times New Roman"/>
+          <w:color w:val="auto"/>
+          <w:sz w:val="24"/>
+          <w:szCs w:val="24"/>
+          <w:lang w:val="en-CA" w:eastAsia="zh-CN"/>
+        </w:rPr>
+        <w:br/>
+        <w:t>“A Comparative Study on Text Classification: Traditional Machine Learning vs. Deep Learning,”</w:t>
+      </w:r>
+      <w:r>
+        <w:rPr>
+          <w:rFonts w:eastAsia="Times New Roman"/>
+          <w:color w:val="auto"/>
+          <w:sz w:val="24"/>
+          <w:szCs w:val="24"/>
+          <w:lang w:val="en-CA" w:eastAsia="zh-CN"/>
+        </w:rPr>
+        <w:br/>
+      </w:r>
       <w:r>
         <w:rPr>
           <w:rFonts w:eastAsia="Times New Roman"/>
@@ -9823,9 +9004,73 @@
           <w:szCs w:val="24"/>
           <w:lang w:val="en-CA" w:eastAsia="zh-CN"/>
         </w:rPr>
-        <w:t>NeurIPS</w:t>
-      </w:r>
-      <w:proofErr w:type="spellEnd"/>
+        <w:t>arXiv preprint arXiv:2005.01803</w:t>
+      </w:r>
+      <w:r>
+        <w:rPr>
+          <w:rFonts w:eastAsia="Times New Roman"/>
+          <w:color w:val="auto"/>
+          <w:sz w:val="24"/>
+          <w:szCs w:val="24"/>
+          <w:lang w:val="en-CA" w:eastAsia="zh-CN"/>
+        </w:rPr>
+        <w:t>, 2020.</w:t>
+      </w:r>
+      <w:r>
+        <w:rPr>
+          <w:rFonts w:eastAsia="Times New Roman"/>
+          <w:color w:val="auto"/>
+          <w:sz w:val="24"/>
+          <w:szCs w:val="24"/>
+          <w:lang w:val="en-CA" w:eastAsia="zh-CN"/>
+        </w:rPr>
+        <w:br/>
+      </w:r>
+      <w:r>
+        <w:rPr>
+          <w:rFonts w:eastAsia="Times New Roman"/>
+          <w:color w:val="auto"/>
+          <w:sz w:val="24"/>
+          <w:szCs w:val="24"/>
+          <w:lang w:val="en-CA" w:eastAsia="zh-CN"/>
+        </w:rPr>
+        <w:lastRenderedPageBreak/>
+        <w:t>(Compares LR, SVM, CNN, LSTM, BERT on computational metrics.)</w:t>
+      </w:r>
+    </w:p>
+    <w:p>
+      <w:pPr>
+        <w:spacing w:before="100" w:beforeAutospacing="1" w:after="100" w:afterAutospacing="1" w:line="240" w:lineRule="auto"/>
+        <w:jc w:val="left"/>
+        <w:rPr>
+          <w:rFonts w:eastAsia="Times New Roman"/>
+          <w:color w:val="auto"/>
+          <w:sz w:val="24"/>
+          <w:szCs w:val="24"/>
+          <w:lang w:val="en-CA" w:eastAsia="zh-CN"/>
+        </w:rPr>
+      </w:pPr>
+      <w:r>
+        <w:rPr>
+          <w:rFonts w:eastAsia="Times New Roman"/>
+          <w:color w:val="auto"/>
+          <w:sz w:val="24"/>
+          <w:szCs w:val="24"/>
+          <w:lang w:val="en-CA" w:eastAsia="zh-CN"/>
+        </w:rPr>
+        <w:t>[7] X. Zhang, J. Zhao, and Y. LeCun,</w:t>
+      </w:r>
+      <w:r>
+        <w:rPr>
+          <w:rFonts w:eastAsia="Times New Roman"/>
+          <w:color w:val="auto"/>
+          <w:sz w:val="24"/>
+          <w:szCs w:val="24"/>
+          <w:lang w:val="en-CA" w:eastAsia="zh-CN"/>
+        </w:rPr>
+        <w:br/>
+        <w:t xml:space="preserve">“Character-Level Convolutional Networks for Text Classification,” </w:t>
+      </w:r>
       <w:r>
         <w:rPr>
           <w:rFonts w:eastAsia="Times New Roman"/>
@@ -9836,7 +9081,7 @@
           <w:szCs w:val="24"/>
           <w:lang w:val="en-CA" w:eastAsia="zh-CN"/>
         </w:rPr>
-        <w:t>)</w:t>
+        <w:t>NeurIPS</w:t>
       </w:r>
       <w:r>
         <w:rPr>
@@ -9846,7 +9091,7 @@
           <w:szCs w:val="24"/>
           <w:lang w:val="en-CA" w:eastAsia="zh-CN"/>
         </w:rPr>
-        <w:t>, 2017.</w:t>
+        <w:t>, 2015. (AG News dataset reference)</w:t>
       </w:r>
     </w:p>
     <w:p>
@@ -9869,52 +9114,8 @@
           <w:szCs w:val="24"/>
           <w:lang w:val="en-CA" w:eastAsia="zh-CN"/>
         </w:rPr>
-        <w:t xml:space="preserve">[6] A. </w:t>
-      </w:r>
-      <w:proofErr w:type="spellStart"/>
-      <w:r>
-        <w:rPr>
-          <w:rFonts w:eastAsia="Times New Roman"/>
-          <w:color w:val="auto"/>
-          <w:sz w:val="24"/>
-          <w:szCs w:val="24"/>
-          <w:lang w:val="en-CA" w:eastAsia="zh-CN"/>
-        </w:rPr>
-        <w:t>Minaee</w:t>
-      </w:r>
-      <w:proofErr w:type="spellEnd"/>
-      <w:r>
-        <w:rPr>
-          <w:rFonts w:eastAsia="Times New Roman"/>
-          <w:color w:val="auto"/>
-          <w:sz w:val="24"/>
-          <w:szCs w:val="24"/>
-          <w:lang w:val="en-CA" w:eastAsia="zh-CN"/>
-        </w:rPr>
-        <w:t>, S. Minaei, and J. Zhu,</w:t>
-      </w:r>
-      <w:r>
-        <w:rPr>
-          <w:rFonts w:eastAsia="Times New Roman"/>
-          <w:color w:val="auto"/>
-          <w:sz w:val="24"/>
-          <w:szCs w:val="24"/>
-          <w:lang w:val="en-CA" w:eastAsia="zh-CN"/>
-        </w:rPr>
-        <w:br/>
-        <w:t>“A Comparative Study on Text Classification: Traditional Machine Learning vs. Deep Learning,”</w:t>
-      </w:r>
-      <w:r>
-        <w:rPr>
-          <w:rFonts w:eastAsia="Times New Roman"/>
-          <w:color w:val="auto"/>
-          <w:sz w:val="24"/>
-          <w:szCs w:val="24"/>
-          <w:lang w:val="en-CA" w:eastAsia="zh-CN"/>
-        </w:rPr>
-        <w:br/>
-      </w:r>
-      <w:proofErr w:type="spellStart"/>
+        <w:t xml:space="preserve">[8] T. Mikolov </w:t>
+      </w:r>
       <w:r>
         <w:rPr>
           <w:rFonts w:eastAsia="Times New Roman"/>
@@ -9925,9 +9126,39 @@
           <w:szCs w:val="24"/>
           <w:lang w:val="en-CA" w:eastAsia="zh-CN"/>
         </w:rPr>
-        <w:t>arXiv</w:t>
-      </w:r>
-      <w:proofErr w:type="spellEnd"/>
+        <w:t>et al.</w:t>
+      </w:r>
+      <w:r>
+        <w:rPr>
+          <w:rFonts w:eastAsia="Times New Roman"/>
+          <w:color w:val="auto"/>
+          <w:sz w:val="24"/>
+          <w:szCs w:val="24"/>
+          <w:lang w:val="en-CA" w:eastAsia="zh-CN"/>
+        </w:rPr>
+        <w:t>,</w:t>
+      </w:r>
+      <w:r>
+        <w:rPr>
+          <w:rFonts w:eastAsia="Times New Roman"/>
+          <w:color w:val="auto"/>
+          <w:sz w:val="24"/>
+          <w:szCs w:val="24"/>
+          <w:lang w:val="en-CA" w:eastAsia="zh-CN"/>
+        </w:rPr>
+        <w:br/>
+        <w:t>“Efficient Estimation of Word Representations in Vector Space,”</w:t>
+      </w:r>
+      <w:r>
+        <w:rPr>
+          <w:rFonts w:eastAsia="Times New Roman"/>
+          <w:color w:val="auto"/>
+          <w:sz w:val="24"/>
+          <w:szCs w:val="24"/>
+          <w:lang w:val="en-CA" w:eastAsia="zh-CN"/>
+        </w:rPr>
+        <w:br/>
+      </w:r>
       <w:r>
         <w:rPr>
           <w:rFonts w:eastAsia="Times New Roman"/>
@@ -9938,7 +9169,7 @@
           <w:szCs w:val="24"/>
           <w:lang w:val="en-CA" w:eastAsia="zh-CN"/>
         </w:rPr>
-        <w:t xml:space="preserve"> preprint arXiv:2005.01803</w:t>
+        <w:t>arXiv:1301.3781</w:t>
       </w:r>
       <w:r>
         <w:rPr>
@@ -9948,9 +9179,13 @@
           <w:szCs w:val="24"/>
           <w:lang w:val="en-CA" w:eastAsia="zh-CN"/>
         </w:rPr>
-        <w:t>, 2020.</w:t>
-      </w:r>
-      <w:r>
+        <w:t>, 2013. (Word2Vec)</w:t>
+      </w:r>
+    </w:p>
+    <w:p>
+      <w:pPr>
+        <w:spacing w:before="100" w:beforeAutospacing="1" w:after="100" w:afterAutospacing="1" w:line="240" w:lineRule="auto"/>
+        <w:jc w:val="left"/>
         <w:rPr>
           <w:rFonts w:eastAsia="Times New Roman"/>
           <w:color w:val="auto"/>
@@ -9958,14 +9193,8 @@
           <w:szCs w:val="24"/>
           <w:lang w:val="en-CA" w:eastAsia="zh-CN"/>
         </w:rPr>
-        <w:br/>
-        <w:t>(Compares LR, SVM, CNN, LSTM, BERT on computational metrics.)</w:t>
-      </w:r>
-    </w:p>
-    <w:p>
-      <w:pPr>
-        <w:spacing w:before="100" w:beforeAutospacing="1" w:after="100" w:afterAutospacing="1" w:line="240" w:lineRule="auto"/>
-        <w:jc w:val="left"/>
+      </w:pPr>
+      <w:r>
         <w:rPr>
           <w:rFonts w:eastAsia="Times New Roman"/>
           <w:color w:val="auto"/>
@@ -9973,29 +9202,8 @@
           <w:szCs w:val="24"/>
           <w:lang w:val="en-CA" w:eastAsia="zh-CN"/>
         </w:rPr>
-      </w:pPr>
-      <w:r>
-        <w:rPr>
-          <w:rFonts w:eastAsia="Times New Roman"/>
-          <w:color w:val="auto"/>
-          <w:sz w:val="24"/>
-          <w:szCs w:val="24"/>
-          <w:lang w:val="en-CA" w:eastAsia="zh-CN"/>
-        </w:rPr>
-        <w:t>[7] X. Zhang, J. Zhao, and Y. LeCun,</w:t>
-      </w:r>
-      <w:r>
-        <w:rPr>
-          <w:rFonts w:eastAsia="Times New Roman"/>
-          <w:color w:val="auto"/>
-          <w:sz w:val="24"/>
-          <w:szCs w:val="24"/>
-          <w:lang w:val="en-CA" w:eastAsia="zh-CN"/>
-        </w:rPr>
-        <w:br/>
-        <w:t xml:space="preserve">“Character-Level Convolutional Networks for Text Classification,” </w:t>
-      </w:r>
-      <w:proofErr w:type="spellStart"/>
+        <w:t xml:space="preserve">[9] Project Proposal: </w:t>
+      </w:r>
       <w:r>
         <w:rPr>
           <w:rFonts w:eastAsia="Times New Roman"/>
@@ -10006,9 +9214,8 @@
           <w:szCs w:val="24"/>
           <w:lang w:val="en-CA" w:eastAsia="zh-CN"/>
         </w:rPr>
-        <w:t>NeurIPS</w:t>
-      </w:r>
-      <w:proofErr w:type="spellEnd"/>
+        <w:t>From First Principles to Transformers — Building &amp; Optimizing NLP Systems for Engineering Applications</w:t>
+      </w:r>
       <w:r>
         <w:rPr>
           <w:rFonts w:eastAsia="Times New Roman"/>
@@ -10017,7 +9224,7 @@
           <w:szCs w:val="24"/>
           <w:lang w:val="en-CA" w:eastAsia="zh-CN"/>
         </w:rPr>
-        <w:t>, 2015. (AG News dataset reference)</w:t>
+        <w:t xml:space="preserve">, internal course document, 2025. </w:t>
       </w:r>
     </w:p>
     <w:p>
@@ -10040,162 +9247,7 @@
           <w:szCs w:val="24"/>
           <w:lang w:val="en-CA" w:eastAsia="zh-CN"/>
         </w:rPr>
-        <w:t xml:space="preserve">[8] T. Mikolov </w:t>
-      </w:r>
-      <w:r>
-        <w:rPr>
-          <w:rFonts w:eastAsia="Times New Roman"/>
-          <w:i/>
-          <w:iCs/>
-          <w:color w:val="auto"/>
-          <w:sz w:val="24"/>
-          <w:szCs w:val="24"/>
-          <w:lang w:val="en-CA" w:eastAsia="zh-CN"/>
-        </w:rPr>
-        <w:t>et al.</w:t>
-      </w:r>
-      <w:r>
-        <w:rPr>
-          <w:rFonts w:eastAsia="Times New Roman"/>
-          <w:color w:val="auto"/>
-          <w:sz w:val="24"/>
-          <w:szCs w:val="24"/>
-          <w:lang w:val="en-CA" w:eastAsia="zh-CN"/>
-        </w:rPr>
-        <w:t>,</w:t>
-      </w:r>
-      <w:r>
-        <w:rPr>
-          <w:rFonts w:eastAsia="Times New Roman"/>
-          <w:color w:val="auto"/>
-          <w:sz w:val="24"/>
-          <w:szCs w:val="24"/>
-          <w:lang w:val="en-CA" w:eastAsia="zh-CN"/>
-        </w:rPr>
-        <w:br/>
-        <w:t>“Efficient Estimation of Word Representations in Vector Space,”</w:t>
-      </w:r>
-      <w:r>
-        <w:rPr>
-          <w:rFonts w:eastAsia="Times New Roman"/>
-          <w:color w:val="auto"/>
-          <w:sz w:val="24"/>
-          <w:szCs w:val="24"/>
-          <w:lang w:val="en-CA" w:eastAsia="zh-CN"/>
-        </w:rPr>
-        <w:br/>
-      </w:r>
-      <w:r>
-        <w:rPr>
-          <w:rFonts w:eastAsia="Times New Roman"/>
-          <w:i/>
-          <w:iCs/>
-          <w:color w:val="auto"/>
-          <w:sz w:val="24"/>
-          <w:szCs w:val="24"/>
-          <w:lang w:val="en-CA" w:eastAsia="zh-CN"/>
-        </w:rPr>
-        <w:t>arXiv:1301.3781</w:t>
-      </w:r>
-      <w:r>
-        <w:rPr>
-          <w:rFonts w:eastAsia="Times New Roman"/>
-          <w:color w:val="auto"/>
-          <w:sz w:val="24"/>
-          <w:szCs w:val="24"/>
-          <w:lang w:val="en-CA" w:eastAsia="zh-CN"/>
-        </w:rPr>
-        <w:t>, 2013. (Word2Vec)</w:t>
-      </w:r>
-    </w:p>
-    <w:p>
-      <w:pPr>
-        <w:spacing w:before="100" w:beforeAutospacing="1" w:after="100" w:afterAutospacing="1" w:line="240" w:lineRule="auto"/>
-        <w:jc w:val="left"/>
-        <w:rPr>
-          <w:rFonts w:eastAsia="Times New Roman"/>
-          <w:color w:val="auto"/>
-          <w:sz w:val="24"/>
-          <w:szCs w:val="24"/>
-          <w:lang w:val="en-CA" w:eastAsia="zh-CN"/>
-        </w:rPr>
-      </w:pPr>
-      <w:r>
-        <w:rPr>
-          <w:rFonts w:eastAsia="Times New Roman"/>
-          <w:color w:val="auto"/>
-          <w:sz w:val="24"/>
-          <w:szCs w:val="24"/>
-          <w:lang w:val="en-CA" w:eastAsia="zh-CN"/>
-        </w:rPr>
-        <w:t xml:space="preserve">[9] Project Proposal: </w:t>
-      </w:r>
-      <w:r>
-        <w:rPr>
-          <w:rFonts w:eastAsia="Times New Roman"/>
-          <w:i/>
-          <w:iCs/>
-          <w:color w:val="auto"/>
-          <w:sz w:val="24"/>
-          <w:szCs w:val="24"/>
-          <w:lang w:val="en-CA" w:eastAsia="zh-CN"/>
-        </w:rPr>
-        <w:t>From First Principles to Transformers — Building &amp; Optimizing NLP Systems for Engineering Applications</w:t>
-      </w:r>
-      <w:r>
-        <w:rPr>
-          <w:rFonts w:eastAsia="Times New Roman"/>
-          <w:color w:val="auto"/>
-          <w:sz w:val="24"/>
-          <w:szCs w:val="24"/>
-          <w:lang w:val="en-CA" w:eastAsia="zh-CN"/>
-        </w:rPr>
-        <w:t xml:space="preserve">, internal course document, 2025. </w:t>
-      </w:r>
-    </w:p>
-    <w:p>
-      <w:pPr>
-        <w:spacing w:before="100" w:beforeAutospacing="1" w:after="100" w:afterAutospacing="1" w:line="240" w:lineRule="auto"/>
-        <w:jc w:val="left"/>
-        <w:rPr>
-          <w:rFonts w:eastAsia="Times New Roman"/>
-          <w:color w:val="auto"/>
-          <w:sz w:val="24"/>
-          <w:szCs w:val="24"/>
-          <w:lang w:val="en-CA" w:eastAsia="zh-CN"/>
-        </w:rPr>
-      </w:pPr>
-      <w:r>
-        <w:rPr>
-          <w:rFonts w:eastAsia="Times New Roman"/>
-          <w:color w:val="auto"/>
-          <w:sz w:val="24"/>
-          <w:szCs w:val="24"/>
-          <w:lang w:val="en-CA" w:eastAsia="zh-CN"/>
-        </w:rPr>
-        <w:t xml:space="preserve">[10] Bag-of-Words, TF-IDF, Embedding, Word2Vec, and BERT </w:t>
-      </w:r>
-      <w:proofErr w:type="spellStart"/>
-      <w:r>
-        <w:rPr>
-          <w:rFonts w:eastAsia="Times New Roman"/>
-          <w:color w:val="auto"/>
-          <w:sz w:val="24"/>
-          <w:szCs w:val="24"/>
-          <w:lang w:val="en-CA" w:eastAsia="zh-CN"/>
-        </w:rPr>
-        <w:t>Jupyter</w:t>
-      </w:r>
-      <w:proofErr w:type="spellEnd"/>
-      <w:r>
-        <w:rPr>
-          <w:rFonts w:eastAsia="Times New Roman"/>
-          <w:color w:val="auto"/>
-          <w:sz w:val="24"/>
-          <w:szCs w:val="24"/>
-          <w:lang w:val="en-CA" w:eastAsia="zh-CN"/>
-        </w:rPr>
-        <w:t xml:space="preserve"> Notebooks, internal project resources, 2025.</w:t>
+        <w:t>[10] Bag-of-Words, TF-IDF, Embedding, Word2Vec, and BERT Jupyter Notebooks, internal project resources, 2025.</w:t>
       </w:r>
     </w:p>
     <w:p>
@@ -10247,49 +9299,7 @@
         <w:rPr>
           <w:lang w:val="en-CA"/>
         </w:rPr>
-        <w:t xml:space="preserve"> Please find the documents in the GITHUB </w:t>
-      </w:r>
-      <w:proofErr w:type="gramStart"/>
-      <w:r>
-        <w:rPr>
-          <w:lang w:val="en-CA"/>
-        </w:rPr>
-        <w:t>Link :</w:t>
-      </w:r>
-      <w:proofErr w:type="gramEnd"/>
-      <w:r>
-        <w:rPr>
-          <w:lang w:val="en-CA"/>
-        </w:rPr>
-        <w:t xml:space="preserve"> https: github.com/mohammad1774/</w:t>
-      </w:r>
-      <w:proofErr w:type="spellStart"/>
-      <w:r>
-        <w:rPr>
-          <w:lang w:val="en-CA"/>
-        </w:rPr>
-        <w:t>applied_ml_</w:t>
-      </w:r>
-      <w:proofErr w:type="gramStart"/>
-      <w:r>
-        <w:rPr>
-          <w:lang w:val="en-CA"/>
-        </w:rPr>
-        <w:t>project</w:t>
-      </w:r>
-      <w:proofErr w:type="spellEnd"/>
-      <w:r>
-        <w:rPr>
-          <w:lang w:val="en-CA"/>
-        </w:rPr>
-        <w:t xml:space="preserve"> .</w:t>
-      </w:r>
-      <w:proofErr w:type="gramEnd"/>
-      <w:r>
-        <w:rPr>
-          <w:lang w:val="en-CA"/>
-        </w:rPr>
-        <w:t xml:space="preserve"> </w:t>
+        <w:t xml:space="preserve"> Please find the documents in the GITHUB Link : https: github.com/mohammad1774/applied_ml_project . </w:t>
       </w:r>
     </w:p>
     <w:p>
@@ -10308,25 +9318,7 @@
           <w:bCs/>
           <w:lang w:val="en-CA"/>
         </w:rPr>
-        <w:t xml:space="preserve">Bag-of-Words Models (LR, RF, </w:t>
-      </w:r>
-      <w:proofErr w:type="spellStart"/>
-      <w:r>
-        <w:rPr>
-          <w:b/>
-          <w:bCs/>
-          <w:lang w:val="en-CA"/>
-        </w:rPr>
-        <w:t>XGBoost</w:t>
-      </w:r>
-      <w:proofErr w:type="spellEnd"/>
-      <w:r>
-        <w:rPr>
-          <w:b/>
-          <w:bCs/>
-          <w:lang w:val="en-CA"/>
-        </w:rPr>
-        <w:t>, MLP, Scratch-MLP)</w:t>
+        <w:t>Bag-of-Words Models (LR, RF, XGBoost, MLP, Scratch-MLP)</w:t>
       </w:r>
     </w:p>
     <w:p>
@@ -10345,25 +9337,7 @@
           <w:bCs/>
           <w:lang w:val="en-CA"/>
         </w:rPr>
-        <w:t xml:space="preserve">TF-IDF Models (LR, RF, </w:t>
-      </w:r>
-      <w:proofErr w:type="spellStart"/>
-      <w:r>
-        <w:rPr>
-          <w:b/>
-          <w:bCs/>
-          <w:lang w:val="en-CA"/>
-        </w:rPr>
-        <w:t>XGBoost</w:t>
-      </w:r>
-      <w:proofErr w:type="spellEnd"/>
-      <w:r>
-        <w:rPr>
-          <w:b/>
-          <w:bCs/>
-          <w:lang w:val="en-CA"/>
-        </w:rPr>
-        <w:t>, MLP, Scratch-MLP)</w:t>
+        <w:t>TF-IDF Models (LR, RF, XGBoost, MLP, Scratch-MLP)</w:t>
       </w:r>
     </w:p>
     <w:p>
@@ -10420,25 +9394,7 @@
           <w:bCs/>
           <w:lang w:val="en-CA"/>
         </w:rPr>
-        <w:t xml:space="preserve">BERT Transformer (Tokenization, Fine-Tuning, </w:t>
-      </w:r>
-      <w:proofErr w:type="spellStart"/>
-      <w:r>
-        <w:rPr>
-          <w:b/>
-          <w:bCs/>
-          <w:lang w:val="en-CA"/>
-        </w:rPr>
-        <w:t>MirroredStrategy</w:t>
-      </w:r>
-      <w:proofErr w:type="spellEnd"/>
-      <w:r>
-        <w:rPr>
-          <w:b/>
-          <w:bCs/>
-          <w:lang w:val="en-CA"/>
-        </w:rPr>
-        <w:t xml:space="preserve"> Multi-GPU)</w:t>
+        <w:t>BERT Transformer (Tokenization, Fine-Tuning, MirroredStrategy Multi-GPU)</w:t>
       </w:r>
     </w:p>
     <w:p>
@@ -10496,21 +9452,7 @@
         <w:rPr>
           <w:lang w:val="fr-FR"/>
         </w:rPr>
-        <w:t xml:space="preserve">Confusion Matrix BOW- </w:t>
-      </w:r>
-      <w:proofErr w:type="spellStart"/>
-      <w:r>
-        <w:rPr>
-          <w:lang w:val="fr-FR"/>
-        </w:rPr>
-        <w:t>Logistic</w:t>
-      </w:r>
-      <w:proofErr w:type="spellEnd"/>
-      <w:r>
-        <w:rPr>
-          <w:lang w:val="fr-FR"/>
-        </w:rPr>
-        <w:t xml:space="preserve"> Mod</w:t>
+        <w:t>Confusion Matrix BOW- Logistic Mod</w:t>
       </w:r>
       <w:r>
         <w:rPr>
@@ -10544,198 +9486,6 @@
                 <pic:pic xmlns:pic="http://schemas.openxmlformats.org/drawingml/2006/picture">
                   <pic:nvPicPr>
                     <pic:cNvPr id="2122020683" name="Picture 7" descr="A graph with numbers and a number in a row&#10;&#10;AI-generated content may be incorrect."/>
-                    <pic:cNvPicPr/>
-                  </pic:nvPicPr>
-                  <pic:blipFill>
-                    <a:blip r:embed="rId16">
-                      <a:extLst>
-                        <a:ext uri="{28A0092B-C50C-407E-A947-70E740481C1C}">
-                          <a14:useLocalDpi xmlns:a14="http://schemas.microsoft.com/office/drawing/2010/main" val="0"/>
-                        </a:ext>
-                      </a:extLst>
-                    </a:blip>
-                    <a:stretch>
-                      <a:fillRect/>
-                    </a:stretch>
-                  </pic:blipFill>
-                  <pic:spPr>
-                    <a:xfrm>
-                      <a:off x="0" y="0"/>
-                      <a:ext cx="2747010" cy="2289175"/>
-                    </a:xfrm>
-                    <a:prstGeom prst="rect">
-                      <a:avLst/>
-                    </a:prstGeom>
-                  </pic:spPr>
-                </pic:pic>
-              </a:graphicData>
-            </a:graphic>
-          </wp:inline>
-        </w:drawing>
-      </w:r>
-    </w:p>
-    <w:p>
-      <w:pPr>
-        <w:pStyle w:val="Heading3"/>
-        <w:numPr>
-          <w:ilvl w:val="0"/>
-          <w:numId w:val="35"/>
-        </w:numPr>
-        <w:rPr>
-          <w:lang w:val="fr-FR"/>
-        </w:rPr>
-      </w:pPr>
-      <w:r>
-        <w:rPr>
-          <w:lang w:val="fr-FR"/>
-        </w:rPr>
-        <w:t xml:space="preserve">Confusion Matrix BOW- </w:t>
-      </w:r>
-      <w:proofErr w:type="spellStart"/>
-      <w:r>
-        <w:rPr>
-          <w:lang w:val="fr-FR"/>
-        </w:rPr>
-        <w:t>Random</w:t>
-      </w:r>
-      <w:proofErr w:type="spellEnd"/>
-      <w:r>
-        <w:rPr>
-          <w:lang w:val="fr-FR"/>
-        </w:rPr>
-        <w:t xml:space="preserve"> Forest</w:t>
-      </w:r>
-      <w:r>
-        <w:rPr>
-          <w:lang w:val="fr-FR"/>
-        </w:rPr>
-        <w:t xml:space="preserve"> Mod</w:t>
-      </w:r>
-      <w:r>
-        <w:rPr>
-          <w:lang w:val="fr-FR"/>
-        </w:rPr>
-        <w:t>el</w:t>
-      </w:r>
-    </w:p>
-    <w:p>
-      <w:pPr>
-        <w:rPr>
-          <w:lang w:val="fr-FR"/>
-        </w:rPr>
-      </w:pPr>
-      <w:r>
-        <w:rPr>
-          <w:noProof/>
-          <w:lang w:val="fr-FR"/>
-          <w14:ligatures w14:val="standardContextual"/>
-        </w:rPr>
-        <w:drawing>
-          <wp:inline distT="0" distB="0" distL="0" distR="0" wp14:anchorId="1328806A" wp14:editId="22922051">
-            <wp:extent cx="2747010" cy="2289175"/>
-            <wp:effectExtent l="0" t="0" r="0" b="0"/>
-            <wp:docPr id="677467785" name="Picture 8" descr="A graph with numbers and a number in blue squares&#10;&#10;AI-generated content may be incorrect."/>
-            <wp:cNvGraphicFramePr>
-              <a:graphicFrameLocks xmlns:a="http://schemas.openxmlformats.org/drawingml/2006/main" noChangeAspect="1"/>
-            </wp:cNvGraphicFramePr>
-            <a:graphic xmlns:a="http://schemas.openxmlformats.org/drawingml/2006/main">
-              <a:graphicData uri="http://schemas.openxmlformats.org/drawingml/2006/picture">
-                <pic:pic xmlns:pic="http://schemas.openxmlformats.org/drawingml/2006/picture">
-                  <pic:nvPicPr>
-                    <pic:cNvPr id="677467785" name="Picture 8" descr="A graph with numbers and a number in blue squares&#10;&#10;AI-generated content may be incorrect."/>
-                    <pic:cNvPicPr/>
-                  </pic:nvPicPr>
-                  <pic:blipFill>
-                    <a:blip r:embed="rId17">
-                      <a:extLst>
-                        <a:ext uri="{28A0092B-C50C-407E-A947-70E740481C1C}">
-                          <a14:useLocalDpi xmlns:a14="http://schemas.microsoft.com/office/drawing/2010/main" val="0"/>
-                        </a:ext>
-                      </a:extLst>
-                    </a:blip>
-                    <a:stretch>
-                      <a:fillRect/>
-                    </a:stretch>
-                  </pic:blipFill>
-                  <pic:spPr>
-                    <a:xfrm>
-                      <a:off x="0" y="0"/>
-                      <a:ext cx="2747010" cy="2289175"/>
-                    </a:xfrm>
-                    <a:prstGeom prst="rect">
-                      <a:avLst/>
-                    </a:prstGeom>
-                  </pic:spPr>
-                </pic:pic>
-              </a:graphicData>
-            </a:graphic>
-          </wp:inline>
-        </w:drawing>
-      </w:r>
-    </w:p>
-    <w:p>
-      <w:pPr>
-        <w:pStyle w:val="Heading3"/>
-        <w:numPr>
-          <w:ilvl w:val="0"/>
-          <w:numId w:val="35"/>
-        </w:numPr>
-        <w:rPr>
-          <w:lang w:val="fr-FR"/>
-        </w:rPr>
-      </w:pPr>
-      <w:r>
-        <w:rPr>
-          <w:lang w:val="fr-FR"/>
-        </w:rPr>
-        <w:t xml:space="preserve">Confusion Matrix BOW- </w:t>
-      </w:r>
-      <w:proofErr w:type="spellStart"/>
-      <w:r>
-        <w:rPr>
-          <w:lang w:val="fr-FR"/>
-        </w:rPr>
-        <w:t>XGBoost</w:t>
-      </w:r>
-      <w:proofErr w:type="spellEnd"/>
-      <w:r>
-        <w:rPr>
-          <w:lang w:val="fr-FR"/>
-        </w:rPr>
-        <w:t xml:space="preserve"> Mod</w:t>
-      </w:r>
-      <w:r>
-        <w:rPr>
-          <w:lang w:val="fr-FR"/>
-        </w:rPr>
-        <w:t>el</w:t>
-      </w:r>
-    </w:p>
-    <w:p>
-      <w:pPr>
-        <w:rPr>
-          <w:lang w:val="fr-FR"/>
-        </w:rPr>
-      </w:pPr>
-      <w:r>
-        <w:rPr>
-          <w:noProof/>
-          <w:lang w:val="fr-FR"/>
-          <w14:ligatures w14:val="standardContextual"/>
-        </w:rPr>
-        <w:drawing>
-          <wp:inline distT="0" distB="0" distL="0" distR="0" wp14:anchorId="4A4FE219" wp14:editId="5C6B4628">
-            <wp:extent cx="2747010" cy="2289175"/>
-            <wp:effectExtent l="0" t="0" r="0" b="0"/>
-            <wp:docPr id="801271075" name="Picture 9" descr="A graph of confusion matrix&#10;&#10;AI-generated content may be incorrect."/>
-            <wp:cNvGraphicFramePr>
-              <a:graphicFrameLocks xmlns:a="http://schemas.openxmlformats.org/drawingml/2006/main" noChangeAspect="1"/>
-            </wp:cNvGraphicFramePr>
-            <a:graphic xmlns:a="http://schemas.openxmlformats.org/drawingml/2006/main">
-              <a:graphicData uri="http://schemas.openxmlformats.org/drawingml/2006/picture">
-                <pic:pic xmlns:pic="http://schemas.openxmlformats.org/drawingml/2006/picture">
-                  <pic:nvPicPr>
-                    <pic:cNvPr id="801271075" name="Picture 9" descr="A graph of confusion matrix&#10;&#10;AI-generated content may be incorrect."/>
                     <pic:cNvPicPr/>
                   </pic:nvPicPr>
                   <pic:blipFill>
@@ -10787,7 +9537,7 @@
         <w:rPr>
           <w:lang w:val="fr-FR"/>
         </w:rPr>
-        <w:t>MLP</w:t>
+        <w:t>Random Forest</w:t>
       </w:r>
       <w:r>
         <w:rPr>
@@ -10815,10 +9565,10 @@
           <w14:ligatures w14:val="standardContextual"/>
         </w:rPr>
         <w:drawing>
-          <wp:inline distT="0" distB="0" distL="0" distR="0" wp14:anchorId="5F2F5D76" wp14:editId="7D6ABBFE">
+          <wp:inline distT="0" distB="0" distL="0" distR="0" wp14:anchorId="1328806A" wp14:editId="22922051">
             <wp:extent cx="2747010" cy="2289175"/>
             <wp:effectExtent l="0" t="0" r="0" b="0"/>
-            <wp:docPr id="1341352838" name="Picture 10" descr="A graph with numbers and a number in a row&#10;&#10;AI-generated content may be incorrect."/>
+            <wp:docPr id="677467785" name="Picture 8" descr="A graph with numbers and a number in blue squares&#10;&#10;AI-generated content may be incorrect."/>
             <wp:cNvGraphicFramePr>
               <a:graphicFrameLocks xmlns:a="http://schemas.openxmlformats.org/drawingml/2006/main" noChangeAspect="1"/>
             </wp:cNvGraphicFramePr>
@@ -10826,7 +9576,7 @@
               <a:graphicData uri="http://schemas.openxmlformats.org/drawingml/2006/picture">
                 <pic:pic xmlns:pic="http://schemas.openxmlformats.org/drawingml/2006/picture">
                   <pic:nvPicPr>
-                    <pic:cNvPr id="1341352838" name="Picture 10" descr="A graph with numbers and a number in a row&#10;&#10;AI-generated content may be incorrect."/>
+                    <pic:cNvPr id="677467785" name="Picture 8" descr="A graph with numbers and a number in blue squares&#10;&#10;AI-generated content may be incorrect."/>
                     <pic:cNvPicPr/>
                   </pic:nvPicPr>
                   <pic:blipFill>
@@ -10872,28 +9622,15 @@
         <w:rPr>
           <w:lang w:val="fr-FR"/>
         </w:rPr>
-        <w:t xml:space="preserve">Confusion Matrix </w:t>
+        <w:lastRenderedPageBreak/>
+        <w:t xml:space="preserve">Confusion Matrix BOW- </w:t>
       </w:r>
       <w:r>
         <w:rPr>
           <w:lang w:val="fr-FR"/>
         </w:rPr>
-        <w:t>TF/IDF</w:t>
-      </w:r>
-      <w:r>
-        <w:rPr>
-          <w:lang w:val="fr-FR"/>
-        </w:rPr>
-        <w:t xml:space="preserve">- </w:t>
-      </w:r>
-      <w:proofErr w:type="spellStart"/>
-      <w:r>
-        <w:rPr>
-          <w:lang w:val="fr-FR"/>
-        </w:rPr>
-        <w:t>Logistic</w:t>
-      </w:r>
-      <w:proofErr w:type="spellEnd"/>
+        <w:t>XGBoost</w:t>
+      </w:r>
       <w:r>
         <w:rPr>
           <w:lang w:val="fr-FR"/>
@@ -10920,10 +9657,10 @@
           <w14:ligatures w14:val="standardContextual"/>
         </w:rPr>
         <w:drawing>
-          <wp:inline distT="0" distB="0" distL="0" distR="0" wp14:anchorId="4DC31747" wp14:editId="43FFFA05">
+          <wp:inline distT="0" distB="0" distL="0" distR="0" wp14:anchorId="4A4FE219" wp14:editId="5C6B4628">
             <wp:extent cx="2747010" cy="2289175"/>
             <wp:effectExtent l="0" t="0" r="0" b="0"/>
-            <wp:docPr id="1587830663" name="Picture 11" descr="A graph with numbers and a number in a row&#10;&#10;AI-generated content may be incorrect."/>
+            <wp:docPr id="801271075" name="Picture 9" descr="A graph of confusion matrix&#10;&#10;AI-generated content may be incorrect."/>
             <wp:cNvGraphicFramePr>
               <a:graphicFrameLocks xmlns:a="http://schemas.openxmlformats.org/drawingml/2006/main" noChangeAspect="1"/>
             </wp:cNvGraphicFramePr>
@@ -10931,7 +9668,7 @@
               <a:graphicData uri="http://schemas.openxmlformats.org/drawingml/2006/picture">
                 <pic:pic xmlns:pic="http://schemas.openxmlformats.org/drawingml/2006/picture">
                   <pic:nvPicPr>
-                    <pic:cNvPr id="1587830663" name="Picture 11" descr="A graph with numbers and a number in a row&#10;&#10;AI-generated content may be incorrect."/>
+                    <pic:cNvPr id="801271075" name="Picture 9" descr="A graph of confusion matrix&#10;&#10;AI-generated content may be incorrect."/>
                     <pic:cNvPicPr/>
                   </pic:nvPicPr>
                   <pic:blipFill>
@@ -10977,35 +9714,13 @@
         <w:rPr>
           <w:lang w:val="fr-FR"/>
         </w:rPr>
-        <w:t xml:space="preserve">Confusion Matrix </w:t>
+        <w:t xml:space="preserve">Confusion Matrix BOW- </w:t>
       </w:r>
       <w:r>
         <w:rPr>
           <w:lang w:val="fr-FR"/>
         </w:rPr>
-        <w:t xml:space="preserve">TF/IDF </w:t>
-      </w:r>
-      <w:proofErr w:type="gramStart"/>
-      <w:r>
-        <w:rPr>
-          <w:lang w:val="fr-FR"/>
-        </w:rPr>
-        <w:t xml:space="preserve">-  </w:t>
-      </w:r>
-      <w:proofErr w:type="spellStart"/>
-      <w:r>
-        <w:rPr>
-          <w:lang w:val="fr-FR"/>
-        </w:rPr>
-        <w:t>Random</w:t>
-      </w:r>
-      <w:proofErr w:type="spellEnd"/>
-      <w:proofErr w:type="gramEnd"/>
-      <w:r>
-        <w:rPr>
-          <w:lang w:val="fr-FR"/>
-        </w:rPr>
-        <w:t xml:space="preserve"> Forest</w:t>
+        <w:t>MLP</w:t>
       </w:r>
       <w:r>
         <w:rPr>
@@ -11033,10 +9748,10 @@
           <w14:ligatures w14:val="standardContextual"/>
         </w:rPr>
         <w:drawing>
-          <wp:inline distT="0" distB="0" distL="0" distR="0" wp14:anchorId="0CFA8DF0" wp14:editId="7DA2712B">
+          <wp:inline distT="0" distB="0" distL="0" distR="0" wp14:anchorId="5F2F5D76" wp14:editId="7D6ABBFE">
             <wp:extent cx="2747010" cy="2289175"/>
             <wp:effectExtent l="0" t="0" r="0" b="0"/>
-            <wp:docPr id="346445533" name="Picture 12" descr="A graph with numbers and a number in blue squares&#10;&#10;AI-generated content may be incorrect."/>
+            <wp:docPr id="1341352838" name="Picture 10" descr="A graph with numbers and a number in a row&#10;&#10;AI-generated content may be incorrect."/>
             <wp:cNvGraphicFramePr>
               <a:graphicFrameLocks xmlns:a="http://schemas.openxmlformats.org/drawingml/2006/main" noChangeAspect="1"/>
             </wp:cNvGraphicFramePr>
@@ -11044,7 +9759,7 @@
               <a:graphicData uri="http://schemas.openxmlformats.org/drawingml/2006/picture">
                 <pic:pic xmlns:pic="http://schemas.openxmlformats.org/drawingml/2006/picture">
                   <pic:nvPicPr>
-                    <pic:cNvPr id="346445533" name="Picture 12" descr="A graph with numbers and a number in blue squares&#10;&#10;AI-generated content may be incorrect."/>
+                    <pic:cNvPr id="1341352838" name="Picture 10" descr="A graph with numbers and a number in a row&#10;&#10;AI-generated content may be incorrect."/>
                     <pic:cNvPicPr/>
                   </pic:nvPicPr>
                   <pic:blipFill>
@@ -11096,35 +9811,13 @@
         <w:rPr>
           <w:lang w:val="fr-FR"/>
         </w:rPr>
-        <w:t xml:space="preserve">TF/IDF </w:t>
-      </w:r>
-      <w:proofErr w:type="gramStart"/>
+        <w:t>TF/IDF</w:t>
+      </w:r>
       <w:r>
         <w:rPr>
           <w:lang w:val="fr-FR"/>
         </w:rPr>
-        <w:t xml:space="preserve">- </w:t>
-      </w:r>
-      <w:r>
-        <w:rPr>
-          <w:lang w:val="fr-FR"/>
-        </w:rPr>
-        <w:t xml:space="preserve"> </w:t>
-      </w:r>
-      <w:proofErr w:type="spellStart"/>
-      <w:r>
-        <w:rPr>
-          <w:lang w:val="fr-FR"/>
-        </w:rPr>
-        <w:t>XGBoost</w:t>
-      </w:r>
-      <w:proofErr w:type="spellEnd"/>
-      <w:proofErr w:type="gramEnd"/>
-      <w:r>
-        <w:rPr>
-          <w:lang w:val="fr-FR"/>
-        </w:rPr>
-        <w:t xml:space="preserve"> Mod</w:t>
+        <w:t>- Logistic Mod</w:t>
       </w:r>
       <w:r>
         <w:rPr>
@@ -11146,10 +9839,10 @@
           <w14:ligatures w14:val="standardContextual"/>
         </w:rPr>
         <w:drawing>
-          <wp:inline distT="0" distB="0" distL="0" distR="0" wp14:anchorId="5CC41CE3" wp14:editId="5C17D4F2">
+          <wp:inline distT="0" distB="0" distL="0" distR="0" wp14:anchorId="4DC31747" wp14:editId="43FFFA05">
             <wp:extent cx="2747010" cy="2289175"/>
             <wp:effectExtent l="0" t="0" r="0" b="0"/>
-            <wp:docPr id="1032324697" name="Picture 13" descr="A graph with numbers and a number in a row&#10;&#10;AI-generated content may be incorrect."/>
+            <wp:docPr id="1587830663" name="Picture 11" descr="A graph with numbers and a number in a row&#10;&#10;AI-generated content may be incorrect."/>
             <wp:cNvGraphicFramePr>
               <a:graphicFrameLocks xmlns:a="http://schemas.openxmlformats.org/drawingml/2006/main" noChangeAspect="1"/>
             </wp:cNvGraphicFramePr>
@@ -11157,7 +9850,7 @@
               <a:graphicData uri="http://schemas.openxmlformats.org/drawingml/2006/picture">
                 <pic:pic xmlns:pic="http://schemas.openxmlformats.org/drawingml/2006/picture">
                   <pic:nvPicPr>
-                    <pic:cNvPr id="1032324697" name="Picture 13" descr="A graph with numbers and a number in a row&#10;&#10;AI-generated content may be incorrect."/>
+                    <pic:cNvPr id="1587830663" name="Picture 11" descr="A graph with numbers and a number in a row&#10;&#10;AI-generated content may be incorrect."/>
                     <pic:cNvPicPr/>
                   </pic:nvPicPr>
                   <pic:blipFill>
@@ -11209,13 +9902,7 @@
         <w:rPr>
           <w:lang w:val="fr-FR"/>
         </w:rPr>
-        <w:t xml:space="preserve">TF/IDF - </w:t>
-      </w:r>
-      <w:r>
-        <w:rPr>
-          <w:lang w:val="fr-FR"/>
-        </w:rPr>
-        <w:t>MLP</w:t>
+        <w:t>TF/IDF -  Random Forest</w:t>
       </w:r>
       <w:r>
         <w:rPr>
@@ -11243,10 +9930,10 @@
           <w14:ligatures w14:val="standardContextual"/>
         </w:rPr>
         <w:drawing>
-          <wp:inline distT="0" distB="0" distL="0" distR="0" wp14:anchorId="33799D30" wp14:editId="6F582EC8">
+          <wp:inline distT="0" distB="0" distL="0" distR="0" wp14:anchorId="0CFA8DF0" wp14:editId="7DA2712B">
             <wp:extent cx="2747010" cy="2289175"/>
             <wp:effectExtent l="0" t="0" r="0" b="0"/>
-            <wp:docPr id="2112007907" name="Picture 14" descr="A graph with numbers and a number in a row&#10;&#10;AI-generated content may be incorrect."/>
+            <wp:docPr id="346445533" name="Picture 12" descr="A graph with numbers and a number in blue squares&#10;&#10;AI-generated content may be incorrect."/>
             <wp:cNvGraphicFramePr>
               <a:graphicFrameLocks xmlns:a="http://schemas.openxmlformats.org/drawingml/2006/main" noChangeAspect="1"/>
             </wp:cNvGraphicFramePr>
@@ -11254,7 +9941,7 @@
               <a:graphicData uri="http://schemas.openxmlformats.org/drawingml/2006/picture">
                 <pic:pic xmlns:pic="http://schemas.openxmlformats.org/drawingml/2006/picture">
                   <pic:nvPicPr>
-                    <pic:cNvPr id="2112007907" name="Picture 14" descr="A graph with numbers and a number in a row&#10;&#10;AI-generated content may be incorrect."/>
+                    <pic:cNvPr id="346445533" name="Picture 12" descr="A graph with numbers and a number in blue squares&#10;&#10;AI-generated content may be incorrect."/>
                     <pic:cNvPicPr/>
                   </pic:nvPicPr>
                   <pic:blipFill>
@@ -11302,33 +9989,23 @@
         </w:rPr>
         <w:t xml:space="preserve">Confusion Matrix </w:t>
       </w:r>
-      <w:proofErr w:type="spellStart"/>
       <w:r>
         <w:rPr>
           <w:lang w:val="fr-FR"/>
         </w:rPr>
-        <w:t>Matrix</w:t>
-      </w:r>
-      <w:proofErr w:type="spellEnd"/>
+        <w:t xml:space="preserve">TF/IDF - </w:t>
+      </w:r>
       <w:r>
         <w:rPr>
           <w:lang w:val="fr-FR"/>
         </w:rPr>
         <w:t xml:space="preserve"> </w:t>
       </w:r>
-      <w:proofErr w:type="spellStart"/>
       <w:r>
         <w:rPr>
           <w:lang w:val="fr-FR"/>
         </w:rPr>
-        <w:t>Embedding</w:t>
-      </w:r>
-      <w:proofErr w:type="spellEnd"/>
-      <w:r>
-        <w:rPr>
-          <w:lang w:val="fr-FR"/>
-        </w:rPr>
-        <w:t xml:space="preserve"> - MLP</w:t>
+        <w:t>XGBoost</w:t>
       </w:r>
       <w:r>
         <w:rPr>
@@ -11356,10 +10033,10 @@
           <w14:ligatures w14:val="standardContextual"/>
         </w:rPr>
         <w:drawing>
-          <wp:inline distT="0" distB="0" distL="0" distR="0" wp14:anchorId="57C61861" wp14:editId="0B592073">
+          <wp:inline distT="0" distB="0" distL="0" distR="0" wp14:anchorId="5CC41CE3" wp14:editId="5C17D4F2">
             <wp:extent cx="2747010" cy="2289175"/>
             <wp:effectExtent l="0" t="0" r="0" b="0"/>
-            <wp:docPr id="1201767381" name="Picture 15" descr="A graph with numbers and a number in a row&#10;&#10;AI-generated content may be incorrect."/>
+            <wp:docPr id="1032324697" name="Picture 13" descr="A graph with numbers and a number in a row&#10;&#10;AI-generated content may be incorrect."/>
             <wp:cNvGraphicFramePr>
               <a:graphicFrameLocks xmlns:a="http://schemas.openxmlformats.org/drawingml/2006/main" noChangeAspect="1"/>
             </wp:cNvGraphicFramePr>
@@ -11367,7 +10044,7 @@
               <a:graphicData uri="http://schemas.openxmlformats.org/drawingml/2006/picture">
                 <pic:pic xmlns:pic="http://schemas.openxmlformats.org/drawingml/2006/picture">
                   <pic:nvPicPr>
-                    <pic:cNvPr id="1201767381" name="Picture 15" descr="A graph with numbers and a number in a row&#10;&#10;AI-generated content may be incorrect."/>
+                    <pic:cNvPr id="1032324697" name="Picture 13" descr="A graph with numbers and a number in a row&#10;&#10;AI-generated content may be incorrect."/>
                     <pic:cNvPicPr/>
                   </pic:nvPicPr>
                   <pic:blipFill>
@@ -11413,27 +10090,25 @@
         <w:rPr>
           <w:lang w:val="fr-FR"/>
         </w:rPr>
-        <w:t>Confusion Matrix</w:t>
+        <w:t xml:space="preserve">Confusion Matrix </w:t>
       </w:r>
       <w:r>
         <w:rPr>
           <w:lang w:val="fr-FR"/>
         </w:rPr>
-        <w:t xml:space="preserve"> : Matrix </w:t>
-      </w:r>
-      <w:proofErr w:type="spellStart"/>
+        <w:t>TF/IDF - MLP</w:t>
+      </w:r>
       <w:r>
         <w:rPr>
           <w:lang w:val="fr-FR"/>
         </w:rPr>
-        <w:t>Embedding</w:t>
-      </w:r>
-      <w:proofErr w:type="spellEnd"/>
+        <w:t xml:space="preserve"> Mod</w:t>
+      </w:r>
       <w:r>
         <w:rPr>
           <w:lang w:val="fr-FR"/>
         </w:rPr>
-        <w:t xml:space="preserve"> – CNN Model</w:t>
+        <w:t>el</w:t>
       </w:r>
     </w:p>
     <w:p>
@@ -11449,10 +10124,10 @@
           <w14:ligatures w14:val="standardContextual"/>
         </w:rPr>
         <w:drawing>
-          <wp:inline distT="0" distB="0" distL="0" distR="0" wp14:anchorId="3837F05A" wp14:editId="2BC1E1F4">
+          <wp:inline distT="0" distB="0" distL="0" distR="0" wp14:anchorId="33799D30" wp14:editId="6F582EC8">
             <wp:extent cx="2747010" cy="2289175"/>
             <wp:effectExtent l="0" t="0" r="0" b="0"/>
-            <wp:docPr id="1841673690" name="Picture 16" descr="A graph with numbers and a number in a row&#10;&#10;AI-generated content may be incorrect."/>
+            <wp:docPr id="2112007907" name="Picture 14" descr="A graph with numbers and a number in a row&#10;&#10;AI-generated content may be incorrect."/>
             <wp:cNvGraphicFramePr>
               <a:graphicFrameLocks xmlns:a="http://schemas.openxmlformats.org/drawingml/2006/main" noChangeAspect="1"/>
             </wp:cNvGraphicFramePr>
@@ -11460,7 +10135,7 @@
               <a:graphicData uri="http://schemas.openxmlformats.org/drawingml/2006/picture">
                 <pic:pic xmlns:pic="http://schemas.openxmlformats.org/drawingml/2006/picture">
                   <pic:nvPicPr>
-                    <pic:cNvPr id="1841673690" name="Picture 16" descr="A graph with numbers and a number in a row&#10;&#10;AI-generated content may be incorrect."/>
+                    <pic:cNvPr id="2112007907" name="Picture 14" descr="A graph with numbers and a number in a row&#10;&#10;AI-generated content may be incorrect."/>
                     <pic:cNvPicPr/>
                   </pic:nvPicPr>
                   <pic:blipFill>
@@ -11506,33 +10181,14 @@
         <w:rPr>
           <w:lang w:val="fr-FR"/>
         </w:rPr>
-        <w:t xml:space="preserve">Confusion </w:t>
-      </w:r>
-      <w:proofErr w:type="gramStart"/>
+        <w:lastRenderedPageBreak/>
+        <w:t xml:space="preserve">Confusion Matrix </w:t>
+      </w:r>
       <w:r>
         <w:rPr>
           <w:lang w:val="fr-FR"/>
         </w:rPr>
-        <w:t>Matrix</w:t>
-      </w:r>
-      <w:r>
-        <w:rPr>
-          <w:lang w:val="fr-FR"/>
-        </w:rPr>
-        <w:t>:</w:t>
-      </w:r>
-      <w:proofErr w:type="gramEnd"/>
-      <w:r>
-        <w:rPr>
-          <w:lang w:val="fr-FR"/>
-        </w:rPr>
-        <w:t xml:space="preserve"> Word2Vec</w:t>
-      </w:r>
-      <w:r>
-        <w:rPr>
-          <w:lang w:val="fr-FR"/>
-        </w:rPr>
-        <w:t>- MLP</w:t>
+        <w:t>Matrix Embedding - MLP</w:t>
       </w:r>
       <w:r>
         <w:rPr>
@@ -11560,10 +10216,10 @@
           <w14:ligatures w14:val="standardContextual"/>
         </w:rPr>
         <w:drawing>
-          <wp:inline distT="0" distB="0" distL="0" distR="0" wp14:anchorId="043C7E0E" wp14:editId="31BD8CCF">
+          <wp:inline distT="0" distB="0" distL="0" distR="0" wp14:anchorId="57C61861" wp14:editId="0B592073">
             <wp:extent cx="2747010" cy="2289175"/>
             <wp:effectExtent l="0" t="0" r="0" b="0"/>
-            <wp:docPr id="435632110" name="Picture 17" descr="A graph with numbers and a number in a row&#10;&#10;AI-generated content may be incorrect."/>
+            <wp:docPr id="1201767381" name="Picture 15" descr="A graph with numbers and a number in a row&#10;&#10;AI-generated content may be incorrect."/>
             <wp:cNvGraphicFramePr>
               <a:graphicFrameLocks xmlns:a="http://schemas.openxmlformats.org/drawingml/2006/main" noChangeAspect="1"/>
             </wp:cNvGraphicFramePr>
@@ -11571,7 +10227,7 @@
               <a:graphicData uri="http://schemas.openxmlformats.org/drawingml/2006/picture">
                 <pic:pic xmlns:pic="http://schemas.openxmlformats.org/drawingml/2006/picture">
                   <pic:nvPicPr>
-                    <pic:cNvPr id="435632110" name="Picture 17" descr="A graph with numbers and a number in a row&#10;&#10;AI-generated content may be incorrect."/>
+                    <pic:cNvPr id="1201767381" name="Picture 15" descr="A graph with numbers and a number in a row&#10;&#10;AI-generated content may be incorrect."/>
                     <pic:cNvPicPr/>
                   </pic:nvPicPr>
                   <pic:blipFill>
@@ -11617,63 +10273,13 @@
         <w:rPr>
           <w:lang w:val="fr-FR"/>
         </w:rPr>
-        <w:t xml:space="preserve">Confusion </w:t>
-      </w:r>
-      <w:proofErr w:type="gramStart"/>
+        <w:t>Confusion Matrix</w:t>
+      </w:r>
       <w:r>
         <w:rPr>
           <w:lang w:val="fr-FR"/>
         </w:rPr>
-        <w:t>Matrix</w:t>
-      </w:r>
-      <w:r>
-        <w:rPr>
-          <w:lang w:val="fr-FR"/>
-        </w:rPr>
-        <w:t>:</w:t>
-      </w:r>
-      <w:proofErr w:type="gramEnd"/>
-      <w:r>
-        <w:rPr>
-          <w:lang w:val="fr-FR"/>
-        </w:rPr>
-        <w:t xml:space="preserve"> </w:t>
-      </w:r>
-      <w:r>
-        <w:rPr>
-          <w:lang w:val="fr-FR"/>
-        </w:rPr>
-        <w:t xml:space="preserve"> </w:t>
-      </w:r>
-      <w:r>
-        <w:rPr>
-          <w:lang w:val="fr-FR"/>
-        </w:rPr>
-        <w:t>Word2Vec</w:t>
-      </w:r>
-      <w:r>
-        <w:rPr>
-          <w:lang w:val="fr-FR"/>
-        </w:rPr>
-        <w:t xml:space="preserve"> </w:t>
-      </w:r>
-      <w:r>
-        <w:rPr>
-          <w:lang w:val="fr-FR"/>
-        </w:rPr>
-        <w:t xml:space="preserve">– CNN </w:t>
-      </w:r>
-      <w:r>
-        <w:rPr>
-          <w:lang w:val="fr-FR"/>
-        </w:rPr>
-        <w:t>Mod</w:t>
-      </w:r>
-      <w:r>
-        <w:rPr>
-          <w:lang w:val="fr-FR"/>
-        </w:rPr>
-        <w:t>el</w:t>
+        <w:t> : Matrix Embedding – CNN Model</w:t>
       </w:r>
     </w:p>
     <w:p>
@@ -11689,10 +10295,10 @@
           <w14:ligatures w14:val="standardContextual"/>
         </w:rPr>
         <w:drawing>
-          <wp:inline distT="0" distB="0" distL="0" distR="0" wp14:anchorId="227EFC6C" wp14:editId="641A48A4">
+          <wp:inline distT="0" distB="0" distL="0" distR="0" wp14:anchorId="3837F05A" wp14:editId="2BC1E1F4">
             <wp:extent cx="2747010" cy="2289175"/>
             <wp:effectExtent l="0" t="0" r="0" b="0"/>
-            <wp:docPr id="1717945051" name="Picture 18" descr="A graph with numbers and a number in blue squares&#10;&#10;AI-generated content may be incorrect."/>
+            <wp:docPr id="1841673690" name="Picture 16" descr="A graph with numbers and a number in a row&#10;&#10;AI-generated content may be incorrect."/>
             <wp:cNvGraphicFramePr>
               <a:graphicFrameLocks xmlns:a="http://schemas.openxmlformats.org/drawingml/2006/main" noChangeAspect="1"/>
             </wp:cNvGraphicFramePr>
@@ -11700,7 +10306,7 @@
               <a:graphicData uri="http://schemas.openxmlformats.org/drawingml/2006/picture">
                 <pic:pic xmlns:pic="http://schemas.openxmlformats.org/drawingml/2006/picture">
                   <pic:nvPicPr>
-                    <pic:cNvPr id="1717945051" name="Picture 18" descr="A graph with numbers and a number in blue squares&#10;&#10;AI-generated content may be incorrect."/>
+                    <pic:cNvPr id="1841673690" name="Picture 16" descr="A graph with numbers and a number in a row&#10;&#10;AI-generated content may be incorrect."/>
                     <pic:cNvPicPr/>
                   </pic:nvPicPr>
                   <pic:blipFill>
@@ -11746,63 +10352,25 @@
         <w:rPr>
           <w:lang w:val="fr-FR"/>
         </w:rPr>
-        <w:t xml:space="preserve">Confusion </w:t>
-      </w:r>
-      <w:proofErr w:type="gramStart"/>
+        <w:t>Confusion Matrix</w:t>
+      </w:r>
       <w:r>
         <w:rPr>
           <w:lang w:val="fr-FR"/>
         </w:rPr>
-        <w:t>Matrix</w:t>
+        <w:t>: Word2Vec- MLP</w:t>
       </w:r>
       <w:r>
         <w:rPr>
           <w:lang w:val="fr-FR"/>
         </w:rPr>
-        <w:t>:</w:t>
-      </w:r>
-      <w:proofErr w:type="gramEnd"/>
+        <w:t xml:space="preserve"> Mod</w:t>
+      </w:r>
       <w:r>
         <w:rPr>
           <w:lang w:val="fr-FR"/>
         </w:rPr>
-        <w:t xml:space="preserve"> </w:t>
-      </w:r>
-      <w:r>
-        <w:rPr>
-          <w:lang w:val="fr-FR"/>
-        </w:rPr>
-        <w:t xml:space="preserve"> </w:t>
-      </w:r>
-      <w:r>
-        <w:rPr>
-          <w:lang w:val="fr-FR"/>
-        </w:rPr>
-        <w:t>BERT</w:t>
-      </w:r>
-      <w:r>
-        <w:rPr>
-          <w:lang w:val="fr-FR"/>
-        </w:rPr>
-        <w:t xml:space="preserve"> – </w:t>
-      </w:r>
-      <w:r>
-        <w:rPr>
-          <w:lang w:val="fr-FR"/>
-        </w:rPr>
-        <w:t>MLP</w:t>
-      </w:r>
-      <w:r>
-        <w:rPr>
-          <w:lang w:val="fr-FR"/>
-        </w:rPr>
-        <w:t xml:space="preserve"> </w:t>
-      </w:r>
-      <w:r>
-        <w:rPr>
-          <w:lang w:val="fr-FR"/>
-        </w:rPr>
-        <w:t>Layer.</w:t>
+        <w:t>el</w:t>
       </w:r>
     </w:p>
     <w:p>
@@ -11818,10 +10386,10 @@
           <w14:ligatures w14:val="standardContextual"/>
         </w:rPr>
         <w:drawing>
-          <wp:inline distT="0" distB="0" distL="0" distR="0" wp14:anchorId="6519A2D1" wp14:editId="425E599A">
+          <wp:inline distT="0" distB="0" distL="0" distR="0" wp14:anchorId="043C7E0E" wp14:editId="31BD8CCF">
             <wp:extent cx="2747010" cy="2289175"/>
             <wp:effectExtent l="0" t="0" r="0" b="0"/>
-            <wp:docPr id="363677464" name="Picture 19" descr="A graph with numbers and a number in blue squares&#10;&#10;AI-generated content may be incorrect."/>
+            <wp:docPr id="435632110" name="Picture 17" descr="A graph with numbers and a number in a row&#10;&#10;AI-generated content may be incorrect."/>
             <wp:cNvGraphicFramePr>
               <a:graphicFrameLocks xmlns:a="http://schemas.openxmlformats.org/drawingml/2006/main" noChangeAspect="1"/>
             </wp:cNvGraphicFramePr>
@@ -11829,11 +10397,11 @@
               <a:graphicData uri="http://schemas.openxmlformats.org/drawingml/2006/picture">
                 <pic:pic xmlns:pic="http://schemas.openxmlformats.org/drawingml/2006/picture">
                   <pic:nvPicPr>
-                    <pic:cNvPr id="363677464" name="Picture 19" descr="A graph with numbers and a number in blue squares&#10;&#10;AI-generated content may be incorrect."/>
+                    <pic:cNvPr id="435632110" name="Picture 17" descr="A graph with numbers and a number in a row&#10;&#10;AI-generated content may be incorrect."/>
                     <pic:cNvPicPr/>
                   </pic:nvPicPr>
                   <pic:blipFill>
-                    <a:blip r:embed="rId28" cstate="print">
+                    <a:blip r:embed="rId28">
                       <a:extLst>
                         <a:ext uri="{28A0092B-C50C-407E-A947-70E740481C1C}">
                           <a14:useLocalDpi xmlns:a14="http://schemas.microsoft.com/office/drawing/2010/main" val="0"/>
@@ -11862,6 +10430,200 @@
     </w:p>
     <w:p>
       <w:pPr>
+        <w:pStyle w:val="Heading3"/>
+        <w:numPr>
+          <w:ilvl w:val="0"/>
+          <w:numId w:val="35"/>
+        </w:numPr>
+        <w:rPr>
+          <w:lang w:val="fr-FR"/>
+        </w:rPr>
+      </w:pPr>
+      <w:r>
+        <w:rPr>
+          <w:lang w:val="fr-FR"/>
+        </w:rPr>
+        <w:t>Confusion Matrix</w:t>
+      </w:r>
+      <w:r>
+        <w:rPr>
+          <w:lang w:val="fr-FR"/>
+        </w:rPr>
+        <w:t xml:space="preserve">: </w:t>
+      </w:r>
+      <w:r>
+        <w:rPr>
+          <w:lang w:val="fr-FR"/>
+        </w:rPr>
+        <w:t xml:space="preserve"> </w:t>
+      </w:r>
+      <w:r>
+        <w:rPr>
+          <w:lang w:val="fr-FR"/>
+        </w:rPr>
+        <w:t xml:space="preserve">Word2Vec – CNN </w:t>
+      </w:r>
+      <w:r>
+        <w:rPr>
+          <w:lang w:val="fr-FR"/>
+        </w:rPr>
+        <w:t>Mod</w:t>
+      </w:r>
+      <w:r>
+        <w:rPr>
+          <w:lang w:val="fr-FR"/>
+        </w:rPr>
+        <w:t>el</w:t>
+      </w:r>
+    </w:p>
+    <w:p>
+      <w:pPr>
+        <w:rPr>
+          <w:lang w:val="fr-FR"/>
+        </w:rPr>
+      </w:pPr>
+      <w:r>
+        <w:rPr>
+          <w:noProof/>
+          <w:lang w:val="fr-FR"/>
+          <w14:ligatures w14:val="standardContextual"/>
+        </w:rPr>
+        <w:drawing>
+          <wp:inline distT="0" distB="0" distL="0" distR="0" wp14:anchorId="227EFC6C" wp14:editId="641A48A4">
+            <wp:extent cx="2747010" cy="2289175"/>
+            <wp:effectExtent l="0" t="0" r="0" b="0"/>
+            <wp:docPr id="1717945051" name="Picture 18" descr="A graph with numbers and a number in blue squares&#10;&#10;AI-generated content may be incorrect."/>
+            <wp:cNvGraphicFramePr>
+              <a:graphicFrameLocks xmlns:a="http://schemas.openxmlformats.org/drawingml/2006/main" noChangeAspect="1"/>
+            </wp:cNvGraphicFramePr>
+            <a:graphic xmlns:a="http://schemas.openxmlformats.org/drawingml/2006/main">
+              <a:graphicData uri="http://schemas.openxmlformats.org/drawingml/2006/picture">
+                <pic:pic xmlns:pic="http://schemas.openxmlformats.org/drawingml/2006/picture">
+                  <pic:nvPicPr>
+                    <pic:cNvPr id="1717945051" name="Picture 18" descr="A graph with numbers and a number in blue squares&#10;&#10;AI-generated content may be incorrect."/>
+                    <pic:cNvPicPr/>
+                  </pic:nvPicPr>
+                  <pic:blipFill>
+                    <a:blip r:embed="rId29">
+                      <a:extLst>
+                        <a:ext uri="{28A0092B-C50C-407E-A947-70E740481C1C}">
+                          <a14:useLocalDpi xmlns:a14="http://schemas.microsoft.com/office/drawing/2010/main" val="0"/>
+                        </a:ext>
+                      </a:extLst>
+                    </a:blip>
+                    <a:stretch>
+                      <a:fillRect/>
+                    </a:stretch>
+                  </pic:blipFill>
+                  <pic:spPr>
+                    <a:xfrm>
+                      <a:off x="0" y="0"/>
+                      <a:ext cx="2747010" cy="2289175"/>
+                    </a:xfrm>
+                    <a:prstGeom prst="rect">
+                      <a:avLst/>
+                    </a:prstGeom>
+                  </pic:spPr>
+                </pic:pic>
+              </a:graphicData>
+            </a:graphic>
+          </wp:inline>
+        </w:drawing>
+      </w:r>
+    </w:p>
+    <w:p>
+      <w:pPr>
+        <w:pStyle w:val="Heading3"/>
+        <w:numPr>
+          <w:ilvl w:val="0"/>
+          <w:numId w:val="35"/>
+        </w:numPr>
+        <w:rPr>
+          <w:lang w:val="fr-FR"/>
+        </w:rPr>
+      </w:pPr>
+      <w:r>
+        <w:rPr>
+          <w:lang w:val="fr-FR"/>
+        </w:rPr>
+        <w:t>Confusion Matrix</w:t>
+      </w:r>
+      <w:r>
+        <w:rPr>
+          <w:lang w:val="fr-FR"/>
+        </w:rPr>
+        <w:t xml:space="preserve">: </w:t>
+      </w:r>
+      <w:r>
+        <w:rPr>
+          <w:lang w:val="fr-FR"/>
+        </w:rPr>
+        <w:t xml:space="preserve"> </w:t>
+      </w:r>
+      <w:r>
+        <w:rPr>
+          <w:lang w:val="fr-FR"/>
+        </w:rPr>
+        <w:t>BERT – MLP Layer.</w:t>
+      </w:r>
+    </w:p>
+    <w:p>
+      <w:pPr>
+        <w:rPr>
+          <w:lang w:val="fr-FR"/>
+        </w:rPr>
+      </w:pPr>
+      <w:r>
+        <w:rPr>
+          <w:noProof/>
+          <w:lang w:val="fr-FR"/>
+          <w14:ligatures w14:val="standardContextual"/>
+        </w:rPr>
+        <w:drawing>
+          <wp:inline distT="0" distB="0" distL="0" distR="0" wp14:anchorId="6519A2D1" wp14:editId="425E599A">
+            <wp:extent cx="2747010" cy="2289175"/>
+            <wp:effectExtent l="0" t="0" r="0" b="0"/>
+            <wp:docPr id="363677464" name="Picture 19" descr="A graph with numbers and a number in blue squares&#10;&#10;AI-generated content may be incorrect."/>
+            <wp:cNvGraphicFramePr>
+              <a:graphicFrameLocks xmlns:a="http://schemas.openxmlformats.org/drawingml/2006/main" noChangeAspect="1"/>
+            </wp:cNvGraphicFramePr>
+            <a:graphic xmlns:a="http://schemas.openxmlformats.org/drawingml/2006/main">
+              <a:graphicData uri="http://schemas.openxmlformats.org/drawingml/2006/picture">
+                <pic:pic xmlns:pic="http://schemas.openxmlformats.org/drawingml/2006/picture">
+                  <pic:nvPicPr>
+                    <pic:cNvPr id="363677464" name="Picture 19" descr="A graph with numbers and a number in blue squares&#10;&#10;AI-generated content may be incorrect."/>
+                    <pic:cNvPicPr/>
+                  </pic:nvPicPr>
+                  <pic:blipFill>
+                    <a:blip r:embed="rId30" cstate="print">
+                      <a:extLst>
+                        <a:ext uri="{28A0092B-C50C-407E-A947-70E740481C1C}">
+                          <a14:useLocalDpi xmlns:a14="http://schemas.microsoft.com/office/drawing/2010/main" val="0"/>
+                        </a:ext>
+                      </a:extLst>
+                    </a:blip>
+                    <a:stretch>
+                      <a:fillRect/>
+                    </a:stretch>
+                  </pic:blipFill>
+                  <pic:spPr>
+                    <a:xfrm>
+                      <a:off x="0" y="0"/>
+                      <a:ext cx="2747010" cy="2289175"/>
+                    </a:xfrm>
+                    <a:prstGeom prst="rect">
+                      <a:avLst/>
+                    </a:prstGeom>
+                  </pic:spPr>
+                </pic:pic>
+              </a:graphicData>
+            </a:graphic>
+          </wp:inline>
+        </w:drawing>
+      </w:r>
+    </w:p>
+    <w:p>
+      <w:pPr>
         <w:rPr>
           <w:lang w:val="fr-FR"/>
         </w:rPr>
@@ -11909,15 +10671,7 @@
     </w:p>
     <w:p>
       <w:r>
-        <w:t xml:space="preserve">This section helps us understand the steps followed in each type of model </w:t>
-      </w:r>
-      <w:proofErr w:type="gramStart"/>
-      <w:r>
-        <w:t>training ,</w:t>
-      </w:r>
-      <w:proofErr w:type="gramEnd"/>
-      <w:r>
-        <w:t xml:space="preserve"> using different types of vectorization methods and models.</w:t>
+        <w:t>This section helps us understand the steps followed in each type of model training , using different types of vectorization methods and models.</w:t>
       </w:r>
     </w:p>
     <w:p/>
@@ -11938,23 +10692,7 @@
           <w:b/>
           <w:bCs/>
         </w:rPr>
-        <w:t xml:space="preserve">Vectorizer Bag of </w:t>
-      </w:r>
-      <w:proofErr w:type="gramStart"/>
-      <w:r>
-        <w:rPr>
-          <w:b/>
-          <w:bCs/>
-        </w:rPr>
-        <w:t>Words :</w:t>
-      </w:r>
-      <w:proofErr w:type="gramEnd"/>
-      <w:r>
-        <w:rPr>
-          <w:b/>
-          <w:bCs/>
-        </w:rPr>
-        <w:t xml:space="preserve"> </w:t>
+        <w:t xml:space="preserve">Vectorizer Bag of Words : </w:t>
       </w:r>
     </w:p>
     <w:p>
@@ -11979,7 +10717,7 @@
                     <pic:cNvPicPr/>
                   </pic:nvPicPr>
                   <pic:blipFill>
-                    <a:blip r:embed="rId29" cstate="print">
+                    <a:blip r:embed="rId31" cstate="print">
                       <a:extLst>
                         <a:ext uri="{28A0092B-C50C-407E-A947-70E740481C1C}">
                           <a14:useLocalDpi xmlns:a14="http://schemas.microsoft.com/office/drawing/2010/main" val="0"/>
@@ -12019,23 +10757,7 @@
           <w:b/>
           <w:bCs/>
         </w:rPr>
-        <w:t xml:space="preserve">Vectorizer TF / </w:t>
-      </w:r>
-      <w:proofErr w:type="gramStart"/>
-      <w:r>
-        <w:rPr>
-          <w:b/>
-          <w:bCs/>
-        </w:rPr>
-        <w:t>IDF :</w:t>
-      </w:r>
-      <w:proofErr w:type="gramEnd"/>
-      <w:r>
-        <w:rPr>
-          <w:b/>
-          <w:bCs/>
-        </w:rPr>
-        <w:t xml:space="preserve"> </w:t>
+        <w:t xml:space="preserve">Vectorizer TF / IDF : </w:t>
       </w:r>
     </w:p>
     <w:p>
@@ -12060,7 +10782,7 @@
                     <pic:cNvPicPr/>
                   </pic:nvPicPr>
                   <pic:blipFill>
-                    <a:blip r:embed="rId30" cstate="print">
+                    <a:blip r:embed="rId32" cstate="print">
                       <a:extLst>
                         <a:ext uri="{28A0092B-C50C-407E-A947-70E740481C1C}">
                           <a14:useLocalDpi xmlns:a14="http://schemas.microsoft.com/office/drawing/2010/main" val="0"/>
@@ -12100,37 +10822,7 @@
           <w:b/>
           <w:bCs/>
         </w:rPr>
-        <w:t xml:space="preserve">Vectorizer </w:t>
-      </w:r>
-      <w:r>
-        <w:rPr>
-          <w:b/>
-          <w:bCs/>
-        </w:rPr>
-        <w:t xml:space="preserve">Matrix </w:t>
-      </w:r>
-      <w:proofErr w:type="gramStart"/>
-      <w:r>
-        <w:rPr>
-          <w:b/>
-          <w:bCs/>
-        </w:rPr>
-        <w:t>Embedding</w:t>
-      </w:r>
-      <w:r>
-        <w:rPr>
-          <w:b/>
-          <w:bCs/>
-        </w:rPr>
-        <w:t xml:space="preserve"> :</w:t>
-      </w:r>
-      <w:proofErr w:type="gramEnd"/>
-      <w:r>
-        <w:rPr>
-          <w:b/>
-          <w:bCs/>
-        </w:rPr>
-        <w:t xml:space="preserve"> </w:t>
+        <w:t xml:space="preserve">Vectorizer Matrix Embedding : </w:t>
       </w:r>
     </w:p>
     <w:p>
@@ -12155,7 +10847,7 @@
                     <pic:cNvPicPr/>
                   </pic:nvPicPr>
                   <pic:blipFill>
-                    <a:blip r:embed="rId31">
+                    <a:blip r:embed="rId33">
                       <a:extLst>
                         <a:ext uri="{28A0092B-C50C-407E-A947-70E740481C1C}">
                           <a14:useLocalDpi xmlns:a14="http://schemas.microsoft.com/office/drawing/2010/main" val="0"/>
@@ -12195,31 +10887,8 @@
           <w:b/>
           <w:bCs/>
         </w:rPr>
-        <w:t xml:space="preserve">Vectorizer </w:t>
-      </w:r>
-      <w:r>
-        <w:rPr>
-          <w:b/>
-          <w:bCs/>
-        </w:rPr>
-        <w:t>Word2</w:t>
-      </w:r>
-      <w:proofErr w:type="gramStart"/>
-      <w:r>
-        <w:rPr>
-          <w:b/>
-          <w:bCs/>
-        </w:rPr>
-        <w:t>Vec</w:t>
-      </w:r>
-      <w:r>
-        <w:rPr>
-          <w:b/>
-          <w:bCs/>
-        </w:rPr>
-        <w:t xml:space="preserve"> :</w:t>
-      </w:r>
-      <w:proofErr w:type="gramEnd"/>
+        <w:t>Vectorizer Word2Vec :</w:t>
+      </w:r>
     </w:p>
     <w:p>
       <w:r>
@@ -12228,7 +10897,7 @@
           <w14:ligatures w14:val="standardContextual"/>
         </w:rPr>
         <w:drawing>
-          <wp:inline distT="0" distB="0" distL="0" distR="0" wp14:anchorId="372E89F7" wp14:editId="276B8170">
+          <wp:inline distT="0" distB="0" distL="0" distR="0" wp14:anchorId="372E89F7" wp14:editId="146B3653">
             <wp:extent cx="2747010" cy="2866390"/>
             <wp:effectExtent l="0" t="0" r="0" b="0"/>
             <wp:docPr id="213995664" name="Picture 23" descr="A diagram of a software model&#10;&#10;AI-generated content may be incorrect."/>
@@ -12243,7 +10912,7 @@
                     <pic:cNvPicPr/>
                   </pic:nvPicPr>
                   <pic:blipFill>
-                    <a:blip r:embed="rId32" cstate="print">
+                    <a:blip r:embed="rId34" cstate="print">
                       <a:extLst>
                         <a:ext uri="{28A0092B-C50C-407E-A947-70E740481C1C}">
                           <a14:useLocalDpi xmlns:a14="http://schemas.microsoft.com/office/drawing/2010/main" val="0"/>
@@ -12274,19 +10943,9 @@
       <w:pPr>
         <w:pStyle w:val="Heading3"/>
       </w:pPr>
-      <w:proofErr w:type="gramStart"/>
-      <w:r>
-        <w:t xml:space="preserve">Vectorizer  </w:t>
-      </w:r>
-      <w:r>
-        <w:t>BERT</w:t>
-      </w:r>
-      <w:proofErr w:type="gramEnd"/>
-      <w:r>
-        <w:t xml:space="preserve"> </w:t>
-      </w:r>
-      <w:r>
-        <w:t xml:space="preserve">: </w:t>
+      <w:r>
+        <w:lastRenderedPageBreak/>
+        <w:t xml:space="preserve">Vectorizer  BERT : </w:t>
       </w:r>
     </w:p>
     <w:p>
@@ -12311,7 +10970,7 @@
                     <pic:cNvPicPr/>
                   </pic:nvPicPr>
                   <pic:blipFill>
-                    <a:blip r:embed="rId33">
+                    <a:blip r:embed="rId35">
                       <a:extLst>
                         <a:ext uri="{28A0092B-C50C-407E-A947-70E740481C1C}">
                           <a14:useLocalDpi xmlns:a14="http://schemas.microsoft.com/office/drawing/2010/main" val="0"/>
@@ -12377,6 +11036,31 @@
 </w:document>
 </file>
 
+<file path=word/endnotes.xml><?xml version="1.0" encoding="utf-8"?>
+<w:endnotes xmlns:wpc="http://schemas.microsoft.com/office/word/2010/wordprocessingCanvas" xmlns:cx="http://schemas.microsoft.com/office/drawing/2014/chartex" xmlns:cx1="http://schemas.microsoft.com/office/drawing/2015/9/8/chartex" xmlns:cx2="http://schemas.microsoft.com/office/drawing/2015/10/21/chartex" xmlns:cx3="http://schemas.microsoft.com/office/drawing/2016/5/9/chartex" xmlns:cx4="http://schemas.microsoft.com/office/drawing/2016/5/10/chartex" xmlns:cx5="http://schemas.microsoft.com/office/drawing/2016/5/11/chartex" xmlns:cx6="http://schemas.microsoft.com/office/drawing/2016/5/12/chartex" xmlns:cx7="http://schemas.microsoft.com/office/drawing/2016/5/13/chartex" xmlns:cx8="http://schemas.microsoft.com/office/drawing/2016/5/14/chartex" xmlns:mc="http://schemas.openxmlformats.org/markup-compatibility/2006" xmlns:aink="http://schemas.microsoft.com/office/drawing/2016/ink" xmlns:am3d="http://schemas.microsoft.com/office/drawing/2017/model3d" xmlns:o="urn:schemas-microsoft-com:office:office" xmlns:oel="http://schemas.microsoft.com/office/2019/extlst" xmlns:r="http://schemas.openxmlformats.org/officeDocument/2006/relationships" xmlns:m="http://schemas.openxmlformats.org/officeDocument/2006/math" xmlns:v="urn:schemas-microsoft-com:vml" xmlns:wp14="http://schemas.microsoft.com/office/word/2010/wordprocessingDrawing" xmlns:wp="http://schemas.openxmlformats.org/drawingml/2006/wordprocessingDrawing" xmlns:w10="urn:schemas-microsoft-com:office:word" xmlns:w="http://schemas.openxmlformats.org/wordprocessingml/2006/main" xmlns:w14="http://schemas.microsoft.com/office/word/2010/wordml" xmlns:w15="http://schemas.microsoft.com/office/word/2012/wordml" xmlns:w16cex="http://schemas.microsoft.com/office/word/2018/wordml/cex" xmlns:w16cid="http://schemas.microsoft.com/office/word/2016/wordml/cid" xmlns:w16="http://schemas.microsoft.com/office/word/2018/wordml" xmlns:w16du="http://schemas.microsoft.com/office/word/2023/wordml/word16du" xmlns:w16sdtdh="http://schemas.microsoft.com/office/word/2020/wordml/sdtdatahash" xmlns:w16sdtfl="http://schemas.microsoft.com/office/word/2024/wordml/sdtformatlock" xmlns:w16se="http://schemas.microsoft.com/office/word/2015/wordml/symex" xmlns:wpg="http://schemas.microsoft.com/office/word/2010/wordprocessingGroup" xmlns:wpi="http://schemas.microsoft.com/office/word/2010/wordprocessingInk" xmlns:wne="http://schemas.microsoft.com/office/word/2006/wordml" xmlns:wps="http://schemas.microsoft.com/office/word/2010/wordprocessingShape" mc:Ignorable="w14 w15 w16se w16cid w16 w16cex w16sdtdh w16sdtfl w16du wp14">
+  <w:endnote w:type="separator" w:id="-1">
+    <w:p>
+      <w:pPr>
+        <w:spacing w:before="0" w:line="240" w:lineRule="auto"/>
+      </w:pPr>
+      <w:r>
+        <w:separator/>
+      </w:r>
+    </w:p>
+  </w:endnote>
+  <w:endnote w:type="continuationSeparator" w:id="0">
+    <w:p>
+      <w:pPr>
+        <w:spacing w:before="0" w:line="240" w:lineRule="auto"/>
+      </w:pPr>
+      <w:r>
+        <w:continuationSeparator/>
+      </w:r>
+    </w:p>
+  </w:endnote>
+</w:endnotes>
+</file>
+
 <file path=word/footer1.xml><?xml version="1.0" encoding="utf-8"?>
 <w:ftr xmlns:wpc="http://schemas.microsoft.com/office/word/2010/wordprocessingCanvas" xmlns:cx="http://schemas.microsoft.com/office/drawing/2014/chartex" xmlns:cx1="http://schemas.microsoft.com/office/drawing/2015/9/8/chartex" xmlns:cx2="http://schemas.microsoft.com/office/drawing/2015/10/21/chartex" xmlns:cx3="http://schemas.microsoft.com/office/drawing/2016/5/9/chartex" xmlns:cx4="http://schemas.microsoft.com/office/drawing/2016/5/10/chartex" xmlns:cx5="http://schemas.microsoft.com/office/drawing/2016/5/11/chartex" xmlns:cx6="http://schemas.microsoft.com/office/drawing/2016/5/12/chartex" xmlns:cx7="http://schemas.microsoft.com/office/drawing/2016/5/13/chartex" xmlns:cx8="http://schemas.microsoft.com/office/drawing/2016/5/14/chartex" xmlns:mc="http://schemas.openxmlformats.org/markup-compatibility/2006" xmlns:aink="http://schemas.microsoft.com/office/drawing/2016/ink" xmlns:am3d="http://schemas.microsoft.com/office/drawing/2017/model3d" xmlns:o="urn:schemas-microsoft-com:office:office" xmlns:oel="http://schemas.microsoft.com/office/2019/extlst" xmlns:r="http://schemas.openxmlformats.org/officeDocument/2006/relationships" xmlns:m="http://schemas.openxmlformats.org/officeDocument/2006/math" xmlns:v="urn:schemas-microsoft-com:vml" xmlns:wp14="http://schemas.microsoft.com/office/word/2010/wordprocessingDrawing" xmlns:wp="http://schemas.openxmlformats.org/drawingml/2006/wordprocessingDrawing" xmlns:w10="urn:schemas-microsoft-com:office:word" xmlns:w="http://schemas.openxmlformats.org/wordprocessingml/2006/main" xmlns:w14="http://schemas.microsoft.com/office/word/2010/wordml" xmlns:w15="http://schemas.microsoft.com/office/word/2012/wordml" xmlns:w16cex="http://schemas.microsoft.com/office/word/2018/wordml/cex" xmlns:w16cid="http://schemas.microsoft.com/office/word/2016/wordml/cid" xmlns:w16="http://schemas.microsoft.com/office/word/2018/wordml" xmlns:w16du="http://schemas.microsoft.com/office/word/2023/wordml/word16du" xmlns:w16sdtdh="http://schemas.microsoft.com/office/word/2020/wordml/sdtdatahash" xmlns:w16sdtfl="http://schemas.microsoft.com/office/word/2024/wordml/sdtformatlock" xmlns:w16se="http://schemas.microsoft.com/office/word/2015/wordml/symex" xmlns:wpg="http://schemas.microsoft.com/office/word/2010/wordprocessingGroup" xmlns:wpi="http://schemas.microsoft.com/office/word/2010/wordprocessingInk" xmlns:wne="http://schemas.microsoft.com/office/word/2006/wordml" xmlns:wps="http://schemas.microsoft.com/office/word/2010/wordprocessingShape" mc:Ignorable="w14 w15 w16se w16cid w16 w16cex w16sdtdh w16sdtfl w16du wp14">
   <w:p>
@@ -12388,6 +11072,31 @@
     </w:r>
   </w:p>
 </w:ftr>
+</file>
+
+<file path=word/footnotes.xml><?xml version="1.0" encoding="utf-8"?>
+<w:footnotes xmlns:wpc="http://schemas.microsoft.com/office/word/2010/wordprocessingCanvas" xmlns:cx="http://schemas.microsoft.com/office/drawing/2014/chartex" xmlns:cx1="http://schemas.microsoft.com/office/drawing/2015/9/8/chartex" xmlns:cx2="http://schemas.microsoft.com/office/drawing/2015/10/21/chartex" xmlns:cx3="http://schemas.microsoft.com/office/drawing/2016/5/9/chartex" xmlns:cx4="http://schemas.microsoft.com/office/drawing/2016/5/10/chartex" xmlns:cx5="http://schemas.microsoft.com/office/drawing/2016/5/11/chartex" xmlns:cx6="http://schemas.microsoft.com/office/drawing/2016/5/12/chartex" xmlns:cx7="http://schemas.microsoft.com/office/drawing/2016/5/13/chartex" xmlns:cx8="http://schemas.microsoft.com/office/drawing/2016/5/14/chartex" xmlns:mc="http://schemas.openxmlformats.org/markup-compatibility/2006" xmlns:aink="http://schemas.microsoft.com/office/drawing/2016/ink" xmlns:am3d="http://schemas.microsoft.com/office/drawing/2017/model3d" xmlns:o="urn:schemas-microsoft-com:office:office" xmlns:oel="http://schemas.microsoft.com/office/2019/extlst" xmlns:r="http://schemas.openxmlformats.org/officeDocument/2006/relationships" xmlns:m="http://schemas.openxmlformats.org/officeDocument/2006/math" xmlns:v="urn:schemas-microsoft-com:vml" xmlns:wp14="http://schemas.microsoft.com/office/word/2010/wordprocessingDrawing" xmlns:wp="http://schemas.openxmlformats.org/drawingml/2006/wordprocessingDrawing" xmlns:w10="urn:schemas-microsoft-com:office:word" xmlns:w="http://schemas.openxmlformats.org/wordprocessingml/2006/main" xmlns:w14="http://schemas.microsoft.com/office/word/2010/wordml" xmlns:w15="http://schemas.microsoft.com/office/word/2012/wordml" xmlns:w16cex="http://schemas.microsoft.com/office/word/2018/wordml/cex" xmlns:w16cid="http://schemas.microsoft.com/office/word/2016/wordml/cid" xmlns:w16="http://schemas.microsoft.com/office/word/2018/wordml" xmlns:w16du="http://schemas.microsoft.com/office/word/2023/wordml/word16du" xmlns:w16sdtdh="http://schemas.microsoft.com/office/word/2020/wordml/sdtdatahash" xmlns:w16sdtfl="http://schemas.microsoft.com/office/word/2024/wordml/sdtformatlock" xmlns:w16se="http://schemas.microsoft.com/office/word/2015/wordml/symex" xmlns:wpg="http://schemas.microsoft.com/office/word/2010/wordprocessingGroup" xmlns:wpi="http://schemas.microsoft.com/office/word/2010/wordprocessingInk" xmlns:wne="http://schemas.microsoft.com/office/word/2006/wordml" xmlns:wps="http://schemas.microsoft.com/office/word/2010/wordprocessingShape" mc:Ignorable="w14 w15 w16se w16cid w16 w16cex w16sdtdh w16sdtfl w16du wp14">
+  <w:footnote w:type="separator" w:id="-1">
+    <w:p>
+      <w:pPr>
+        <w:spacing w:before="0" w:line="240" w:lineRule="auto"/>
+      </w:pPr>
+      <w:r>
+        <w:separator/>
+      </w:r>
+    </w:p>
+  </w:footnote>
+  <w:footnote w:type="continuationSeparator" w:id="0">
+    <w:p>
+      <w:pPr>
+        <w:spacing w:before="0" w:line="240" w:lineRule="auto"/>
+      </w:pPr>
+      <w:r>
+        <w:continuationSeparator/>
+      </w:r>
+    </w:p>
+  </w:footnote>
+</w:footnotes>
 </file>
 
 <file path=word/numbering.xml><?xml version="1.0" encoding="utf-8"?>
@@ -15597,6 +14306,7 @@
   <w:style w:type="character" w:default="1" w:styleId="DefaultParagraphFont">
     <w:name w:val="Default Paragraph Font"/>
     <w:uiPriority w:val="1"/>
+    <w:semiHidden/>
     <w:unhideWhenUsed/>
   </w:style>
   <w:style w:type="table" w:default="1" w:styleId="TableNormal">
@@ -16466,6 +15176,15 @@
 </file>
 
 <file path=customXml/item1.xml><?xml version="1.0" encoding="utf-8"?>
+<?mso-contentType ?>
+<FormTemplates xmlns="http://schemas.microsoft.com/sharepoint/v3/contenttype/forms">
+  <Display>DocumentLibraryForm</Display>
+  <Edit>DocumentLibraryForm</Edit>
+  <New>DocumentLibraryForm</New>
+</FormTemplates>
+</file>
+
+<file path=customXml/item2.xml><?xml version="1.0" encoding="utf-8"?>
 <ct:contentTypeSchema xmlns:ct="http://schemas.microsoft.com/office/2006/metadata/contentType" xmlns:ma="http://schemas.microsoft.com/office/2006/metadata/properties/metaAttributes" ct:_="" ma:_="" ma:contentTypeName="Document" ma:contentTypeID="0x01010017B48702EF877B4693DF3108FB2EFF41" ma:contentTypeVersion="5" ma:contentTypeDescription="Create a new document." ma:contentTypeScope="" ma:versionID="da5813183de1a7618c6270740033a01c">
   <xsd:schema xmlns:xsd="http://www.w3.org/2001/XMLSchema" xmlns:xs="http://www.w3.org/2001/XMLSchema" xmlns:p="http://schemas.microsoft.com/office/2006/metadata/properties" xmlns:ns3="e8e00646-7195-4bde-8e40-9cace449234e" targetNamespace="http://schemas.microsoft.com/office/2006/metadata/properties" ma:root="true" ma:fieldsID="8561c6717f4597acfc809afc9790f1d6" ns3:_="">
     <xsd:import namespace="e8e00646-7195-4bde-8e40-9cace449234e"/>
@@ -16615,15 +15334,6 @@
 </ct:contentTypeSchema>
 </file>
 
-<file path=customXml/item2.xml><?xml version="1.0" encoding="utf-8"?>
-<?mso-contentType ?>
-<FormTemplates xmlns="http://schemas.microsoft.com/sharepoint/v3/contenttype/forms">
-  <Display>DocumentLibraryForm</Display>
-  <Edit>DocumentLibraryForm</Edit>
-  <New>DocumentLibraryForm</New>
-</FormTemplates>
-</file>
-
 <file path=customXml/item3.xml><?xml version="1.0" encoding="utf-8"?>
 <p:properties xmlns:p="http://schemas.microsoft.com/office/2006/metadata/properties" xmlns:xsi="http://www.w3.org/2001/XMLSchema-instance" xmlns:pc="http://schemas.microsoft.com/office/infopath/2007/PartnerControls">
   <documentManagement>
@@ -16633,6 +15343,14 @@
 </file>
 
 <file path=customXml/itemProps1.xml><?xml version="1.0" encoding="utf-8"?>
+<ds:datastoreItem xmlns:ds="http://schemas.openxmlformats.org/officeDocument/2006/customXml" ds:itemID="{719B3423-DF5C-471A-B625-B329CF12B47F}">
+  <ds:schemaRefs>
+    <ds:schemaRef ds:uri="http://schemas.microsoft.com/sharepoint/v3/contenttype/forms"/>
+  </ds:schemaRefs>
+</ds:datastoreItem>
+</file>
+
+<file path=customXml/itemProps2.xml><?xml version="1.0" encoding="utf-8"?>
 <ds:datastoreItem xmlns:ds="http://schemas.openxmlformats.org/officeDocument/2006/customXml" ds:itemID="{A654CF24-6192-4C12-9107-244639C4844F}">
   <ds:schemaRefs>
     <ds:schemaRef ds:uri="http://schemas.microsoft.com/office/2006/metadata/contentType"/>
@@ -16650,26 +15368,12 @@
 </ds:datastoreItem>
 </file>
 
-<file path=customXml/itemProps2.xml><?xml version="1.0" encoding="utf-8"?>
-<ds:datastoreItem xmlns:ds="http://schemas.openxmlformats.org/officeDocument/2006/customXml" ds:itemID="{719B3423-DF5C-471A-B625-B329CF12B47F}">
-  <ds:schemaRefs>
-    <ds:schemaRef ds:uri="http://schemas.microsoft.com/sharepoint/v3/contenttype/forms"/>
-  </ds:schemaRefs>
-</ds:datastoreItem>
-</file>
-
 <file path=customXml/itemProps3.xml><?xml version="1.0" encoding="utf-8"?>
 <ds:datastoreItem xmlns:ds="http://schemas.openxmlformats.org/officeDocument/2006/customXml" ds:itemID="{EF31C428-1FDC-4066-A855-421F7046AFC1}">
   <ds:schemaRefs>
-    <ds:schemaRef ds:uri="http://purl.org/dc/elements/1.1/"/>
     <ds:schemaRef ds:uri="http://schemas.microsoft.com/office/2006/metadata/properties"/>
+    <ds:schemaRef ds:uri="http://schemas.microsoft.com/office/infopath/2007/PartnerControls"/>
     <ds:schemaRef ds:uri="e8e00646-7195-4bde-8e40-9cace449234e"/>
-    <ds:schemaRef ds:uri="http://purl.org/dc/terms/"/>
-    <ds:schemaRef ds:uri="http://purl.org/dc/dcmitype/"/>
-    <ds:schemaRef ds:uri="http://www.w3.org/XML/1998/namespace"/>
-    <ds:schemaRef ds:uri="http://schemas.microsoft.com/office/2006/documentManagement/types"/>
-    <ds:schemaRef ds:uri="http://schemas.microsoft.com/office/infopath/2007/PartnerControls"/>
-    <ds:schemaRef ds:uri="http://schemas.openxmlformats.org/package/2006/metadata/core-properties"/>
   </ds:schemaRefs>
 </ds:datastoreItem>
 </file>
</xml_diff>